<commit_message>
PC -> lap: Bajo nivel
</commit_message>
<xml_diff>
--- a/TAREAS 6 SEMESTRE/Programación Bajo Nivel/QuijasContrerasAct1.docx
+++ b/TAREAS 6 SEMESTRE/Programación Bajo Nivel/QuijasContrerasAct1.docx
@@ -1461,7 +1461,7 @@
         <w:br w:type="page"/>
       </w:r>
     </w:p>
-    <w:bookmarkStart w:id="0" w:name="_Toc220850609" w:displacedByCustomXml="next"/>
+    <w:bookmarkStart w:id="0" w:name="_Toc238505592" w:displacedByCustomXml="next"/>
     <w:sdt>
       <w:sdtPr>
         <w:rPr>
@@ -1528,7 +1528,7 @@
           <w:r>
             <w:fldChar w:fldCharType="separate"/>
           </w:r>
-          <w:hyperlink w:anchor="_Toc220850609" w:history="1">
+          <w:hyperlink w:anchor="_Toc238505592" w:history="1">
             <w:r>
               <w:rPr>
                 <w:rStyle w:val="Hipervnculo"/>
@@ -1556,7 +1556,7 @@
                 <w:noProof/>
                 <w:webHidden/>
               </w:rPr>
-              <w:instrText xml:space="preserve"> PAGEREF _Toc220850609 \h </w:instrText>
+              <w:instrText xml:space="preserve"> PAGEREF _Toc238505592 \h </w:instrText>
             </w:r>
             <w:r>
               <w:rPr>
@@ -1599,7 +1599,7 @@
               <w:color w:val="auto"/>
             </w:rPr>
           </w:pPr>
-          <w:hyperlink w:anchor="_Toc220850610" w:history="1">
+          <w:hyperlink w:anchor="_Toc238505593" w:history="1">
             <w:r>
               <w:rPr>
                 <w:rStyle w:val="Hipervnculo"/>
@@ -1626,7 +1626,7 @@
                 <w:noProof/>
                 <w:webHidden/>
               </w:rPr>
-              <w:instrText xml:space="preserve"> PAGEREF _Toc220850610 \h </w:instrText>
+              <w:instrText xml:space="preserve"> PAGEREF _Toc238505593 \h </w:instrText>
             </w:r>
             <w:r>
               <w:rPr>
@@ -1669,13 +1669,13 @@
               <w:color w:val="auto"/>
             </w:rPr>
           </w:pPr>
-          <w:hyperlink w:anchor="_Toc220850611" w:history="1">
+          <w:hyperlink w:anchor="_Toc238505594" w:history="1">
             <w:r>
               <w:rPr>
                 <w:rStyle w:val="Hipervnculo"/>
                 <w:noProof/>
               </w:rPr>
-              <w:t>Desarrollo</w:t>
+              <w:t>El modelo de programación</w:t>
             </w:r>
             <w:r>
               <w:rPr>
@@ -1696,7 +1696,7 @@
                 <w:noProof/>
                 <w:webHidden/>
               </w:rPr>
-              <w:instrText xml:space="preserve"> PAGEREF _Toc220850611 \h </w:instrText>
+              <w:instrText xml:space="preserve"> PAGEREF _Toc238505594 \h </w:instrText>
             </w:r>
             <w:r>
               <w:rPr>
@@ -1739,7 +1739,357 @@
               <w:color w:val="auto"/>
             </w:rPr>
           </w:pPr>
-          <w:hyperlink w:anchor="_Toc220850612" w:history="1">
+          <w:hyperlink w:anchor="_Toc238505595" w:history="1">
+            <w:r>
+              <w:rPr>
+                <w:rStyle w:val="Hipervnculo"/>
+                <w:noProof/>
+              </w:rPr>
+              <w:t>Registros</w:t>
+            </w:r>
+            <w:r>
+              <w:rPr>
+                <w:noProof/>
+                <w:webHidden/>
+              </w:rPr>
+              <w:tab/>
+            </w:r>
+            <w:r>
+              <w:rPr>
+                <w:noProof/>
+                <w:webHidden/>
+              </w:rPr>
+              <w:fldChar w:fldCharType="begin"/>
+            </w:r>
+            <w:r>
+              <w:rPr>
+                <w:noProof/>
+                <w:webHidden/>
+              </w:rPr>
+              <w:instrText xml:space="preserve"> PAGEREF _Toc238505595 \h </w:instrText>
+            </w:r>
+            <w:r>
+              <w:rPr>
+                <w:noProof/>
+                <w:webHidden/>
+              </w:rPr>
+            </w:r>
+            <w:r>
+              <w:rPr>
+                <w:noProof/>
+                <w:webHidden/>
+              </w:rPr>
+              <w:fldChar w:fldCharType="separate"/>
+            </w:r>
+            <w:r>
+              <w:rPr>
+                <w:noProof/>
+                <w:webHidden/>
+              </w:rPr>
+              <w:t>2</w:t>
+            </w:r>
+            <w:r>
+              <w:rPr>
+                <w:noProof/>
+                <w:webHidden/>
+              </w:rPr>
+              <w:fldChar w:fldCharType="end"/>
+            </w:r>
+          </w:hyperlink>
+        </w:p>
+        <w:p>
+          <w:pPr>
+            <w:pStyle w:val="TDC2"/>
+            <w:tabs>
+              <w:tab w:val="right" w:leader="dot" w:pos="9111"/>
+            </w:tabs>
+            <w:rPr>
+              <w:rFonts w:asciiTheme="minorHAnsi" w:eastAsiaTheme="minorEastAsia" w:hAnsiTheme="minorHAnsi" w:cstheme="minorBidi"/>
+              <w:noProof/>
+              <w:color w:val="auto"/>
+            </w:rPr>
+          </w:pPr>
+          <w:hyperlink w:anchor="_Toc238505596" w:history="1">
+            <w:r>
+              <w:rPr>
+                <w:rStyle w:val="Hipervnculo"/>
+                <w:noProof/>
+              </w:rPr>
+              <w:t>Registros Multipropósito</w:t>
+            </w:r>
+            <w:r>
+              <w:rPr>
+                <w:noProof/>
+                <w:webHidden/>
+              </w:rPr>
+              <w:tab/>
+            </w:r>
+            <w:r>
+              <w:rPr>
+                <w:noProof/>
+                <w:webHidden/>
+              </w:rPr>
+              <w:fldChar w:fldCharType="begin"/>
+            </w:r>
+            <w:r>
+              <w:rPr>
+                <w:noProof/>
+                <w:webHidden/>
+              </w:rPr>
+              <w:instrText xml:space="preserve"> PAGEREF _Toc238505596 \h </w:instrText>
+            </w:r>
+            <w:r>
+              <w:rPr>
+                <w:noProof/>
+                <w:webHidden/>
+              </w:rPr>
+            </w:r>
+            <w:r>
+              <w:rPr>
+                <w:noProof/>
+                <w:webHidden/>
+              </w:rPr>
+              <w:fldChar w:fldCharType="separate"/>
+            </w:r>
+            <w:r>
+              <w:rPr>
+                <w:noProof/>
+                <w:webHidden/>
+              </w:rPr>
+              <w:t>2</w:t>
+            </w:r>
+            <w:r>
+              <w:rPr>
+                <w:noProof/>
+                <w:webHidden/>
+              </w:rPr>
+              <w:fldChar w:fldCharType="end"/>
+            </w:r>
+          </w:hyperlink>
+        </w:p>
+        <w:p>
+          <w:pPr>
+            <w:pStyle w:val="TDC2"/>
+            <w:tabs>
+              <w:tab w:val="right" w:leader="dot" w:pos="9111"/>
+            </w:tabs>
+            <w:rPr>
+              <w:rFonts w:asciiTheme="minorHAnsi" w:eastAsiaTheme="minorEastAsia" w:hAnsiTheme="minorHAnsi" w:cstheme="minorBidi"/>
+              <w:noProof/>
+              <w:color w:val="auto"/>
+            </w:rPr>
+          </w:pPr>
+          <w:hyperlink w:anchor="_Toc238505597" w:history="1">
+            <w:r>
+              <w:rPr>
+                <w:rStyle w:val="Hipervnculo"/>
+                <w:noProof/>
+              </w:rPr>
+              <w:t>Registros de Propósito Especial</w:t>
+            </w:r>
+            <w:r>
+              <w:rPr>
+                <w:noProof/>
+                <w:webHidden/>
+              </w:rPr>
+              <w:tab/>
+            </w:r>
+            <w:r>
+              <w:rPr>
+                <w:noProof/>
+                <w:webHidden/>
+              </w:rPr>
+              <w:fldChar w:fldCharType="begin"/>
+            </w:r>
+            <w:r>
+              <w:rPr>
+                <w:noProof/>
+                <w:webHidden/>
+              </w:rPr>
+              <w:instrText xml:space="preserve"> PAGEREF _Toc238505597 \h </w:instrText>
+            </w:r>
+            <w:r>
+              <w:rPr>
+                <w:noProof/>
+                <w:webHidden/>
+              </w:rPr>
+            </w:r>
+            <w:r>
+              <w:rPr>
+                <w:noProof/>
+                <w:webHidden/>
+              </w:rPr>
+              <w:fldChar w:fldCharType="separate"/>
+            </w:r>
+            <w:r>
+              <w:rPr>
+                <w:noProof/>
+                <w:webHidden/>
+              </w:rPr>
+              <w:t>2</w:t>
+            </w:r>
+            <w:r>
+              <w:rPr>
+                <w:noProof/>
+                <w:webHidden/>
+              </w:rPr>
+              <w:fldChar w:fldCharType="end"/>
+            </w:r>
+          </w:hyperlink>
+        </w:p>
+        <w:p>
+          <w:pPr>
+            <w:pStyle w:val="TDC2"/>
+            <w:tabs>
+              <w:tab w:val="right" w:leader="dot" w:pos="9111"/>
+            </w:tabs>
+            <w:rPr>
+              <w:rFonts w:asciiTheme="minorHAnsi" w:eastAsiaTheme="minorEastAsia" w:hAnsiTheme="minorHAnsi" w:cstheme="minorBidi"/>
+              <w:noProof/>
+              <w:color w:val="auto"/>
+            </w:rPr>
+          </w:pPr>
+          <w:hyperlink w:anchor="_Toc238505598" w:history="1">
+            <w:r>
+              <w:rPr>
+                <w:rStyle w:val="Hipervnculo"/>
+                <w:noProof/>
+              </w:rPr>
+              <w:t>Registros de Segmento</w:t>
+            </w:r>
+            <w:r>
+              <w:rPr>
+                <w:noProof/>
+                <w:webHidden/>
+              </w:rPr>
+              <w:tab/>
+            </w:r>
+            <w:r>
+              <w:rPr>
+                <w:noProof/>
+                <w:webHidden/>
+              </w:rPr>
+              <w:fldChar w:fldCharType="begin"/>
+            </w:r>
+            <w:r>
+              <w:rPr>
+                <w:noProof/>
+                <w:webHidden/>
+              </w:rPr>
+              <w:instrText xml:space="preserve"> PAGEREF _Toc238505598 \h </w:instrText>
+            </w:r>
+            <w:r>
+              <w:rPr>
+                <w:noProof/>
+                <w:webHidden/>
+              </w:rPr>
+            </w:r>
+            <w:r>
+              <w:rPr>
+                <w:noProof/>
+                <w:webHidden/>
+              </w:rPr>
+              <w:fldChar w:fldCharType="separate"/>
+            </w:r>
+            <w:r>
+              <w:rPr>
+                <w:noProof/>
+                <w:webHidden/>
+              </w:rPr>
+              <w:t>3</w:t>
+            </w:r>
+            <w:r>
+              <w:rPr>
+                <w:noProof/>
+                <w:webHidden/>
+              </w:rPr>
+              <w:fldChar w:fldCharType="end"/>
+            </w:r>
+          </w:hyperlink>
+        </w:p>
+        <w:p>
+          <w:pPr>
+            <w:pStyle w:val="TDC2"/>
+            <w:tabs>
+              <w:tab w:val="right" w:leader="dot" w:pos="9111"/>
+            </w:tabs>
+            <w:rPr>
+              <w:rFonts w:asciiTheme="minorHAnsi" w:eastAsiaTheme="minorEastAsia" w:hAnsiTheme="minorHAnsi" w:cstheme="minorBidi"/>
+              <w:noProof/>
+              <w:color w:val="auto"/>
+            </w:rPr>
+          </w:pPr>
+          <w:hyperlink w:anchor="_Toc238505599" w:history="1">
+            <w:r>
+              <w:rPr>
+                <w:rStyle w:val="Hipervnculo"/>
+                <w:noProof/>
+              </w:rPr>
+              <w:t>Desglose de Bits del registro EFLAGS</w:t>
+            </w:r>
+            <w:r>
+              <w:rPr>
+                <w:noProof/>
+                <w:webHidden/>
+              </w:rPr>
+              <w:tab/>
+            </w:r>
+            <w:r>
+              <w:rPr>
+                <w:noProof/>
+                <w:webHidden/>
+              </w:rPr>
+              <w:fldChar w:fldCharType="begin"/>
+            </w:r>
+            <w:r>
+              <w:rPr>
+                <w:noProof/>
+                <w:webHidden/>
+              </w:rPr>
+              <w:instrText xml:space="preserve"> PAGEREF _Toc238505599 \h </w:instrText>
+            </w:r>
+            <w:r>
+              <w:rPr>
+                <w:noProof/>
+                <w:webHidden/>
+              </w:rPr>
+            </w:r>
+            <w:r>
+              <w:rPr>
+                <w:noProof/>
+                <w:webHidden/>
+              </w:rPr>
+              <w:fldChar w:fldCharType="separate"/>
+            </w:r>
+            <w:r>
+              <w:rPr>
+                <w:noProof/>
+                <w:webHidden/>
+              </w:rPr>
+              <w:t>3</w:t>
+            </w:r>
+            <w:r>
+              <w:rPr>
+                <w:noProof/>
+                <w:webHidden/>
+              </w:rPr>
+              <w:fldChar w:fldCharType="end"/>
+            </w:r>
+          </w:hyperlink>
+        </w:p>
+        <w:p>
+          <w:pPr>
+            <w:pStyle w:val="TDC1"/>
+            <w:tabs>
+              <w:tab w:val="right" w:leader="dot" w:pos="9111"/>
+            </w:tabs>
+            <w:rPr>
+              <w:rFonts w:asciiTheme="minorHAnsi" w:eastAsiaTheme="minorEastAsia" w:hAnsiTheme="minorHAnsi" w:cstheme="minorBidi"/>
+              <w:noProof/>
+              <w:color w:val="auto"/>
+            </w:rPr>
+          </w:pPr>
+          <w:hyperlink w:anchor="_Toc238505600" w:history="1">
             <w:r>
               <w:rPr>
                 <w:rStyle w:val="Hipervnculo"/>
@@ -1766,7 +2116,7 @@
                 <w:noProof/>
                 <w:webHidden/>
               </w:rPr>
-              <w:instrText xml:space="preserve"> PAGEREF _Toc220850612 \h </w:instrText>
+              <w:instrText xml:space="preserve"> PAGEREF _Toc238505600 \h </w:instrText>
             </w:r>
             <w:r>
               <w:rPr>
@@ -1786,7 +2136,7 @@
                 <w:noProof/>
                 <w:webHidden/>
               </w:rPr>
-              <w:t>1</w:t>
+              <w:t>4</w:t>
             </w:r>
             <w:r>
               <w:rPr>
@@ -1809,7 +2159,7 @@
               <w:color w:val="auto"/>
             </w:rPr>
           </w:pPr>
-          <w:hyperlink w:anchor="_Toc220850613" w:history="1">
+          <w:hyperlink w:anchor="_Toc238505601" w:history="1">
             <w:r>
               <w:rPr>
                 <w:rStyle w:val="Hipervnculo"/>
@@ -1836,7 +2186,7 @@
                 <w:noProof/>
                 <w:webHidden/>
               </w:rPr>
-              <w:instrText xml:space="preserve"> PAGEREF _Toc220850613 \h </w:instrText>
+              <w:instrText xml:space="preserve"> PAGEREF _Toc238505601 \h </w:instrText>
             </w:r>
             <w:r>
               <w:rPr>
@@ -1856,7 +2206,7 @@
                 <w:noProof/>
                 <w:webHidden/>
               </w:rPr>
-              <w:t>1</w:t>
+              <w:t>4</w:t>
             </w:r>
             <w:r>
               <w:rPr>
@@ -1883,33 +2233,109 @@
       <w:pPr>
         <w:pStyle w:val="Ttulo1"/>
       </w:pPr>
-      <w:bookmarkStart w:id="1" w:name="_Toc220850610"/>
+      <w:bookmarkStart w:id="1" w:name="_Toc238505593"/>
       <w:r>
         <w:t>Tabla de ilustraciones</w:t>
       </w:r>
       <w:bookmarkEnd w:id="1"/>
     </w:p>
     <w:p>
-      <w:fldSimple w:instr=" TOC \h \z \c &quot;Ilustración&quot; ">
+      <w:pPr>
+        <w:pStyle w:val="Tabladeilustraciones"/>
+        <w:tabs>
+          <w:tab w:val="right" w:leader="dot" w:pos="9111"/>
+        </w:tabs>
+        <w:rPr>
+          <w:noProof/>
+        </w:rPr>
+      </w:pPr>
+      <w:r>
+        <w:fldChar w:fldCharType="begin"/>
+      </w:r>
+      <w:r>
+        <w:instrText xml:space="preserve"> TOC \h \z \c "Ilustración" </w:instrText>
+      </w:r>
+      <w:r>
+        <w:fldChar w:fldCharType="separate"/>
+      </w:r>
+      <w:hyperlink w:anchor="_Toc238505575" w:history="1">
         <w:r>
           <w:rPr>
-            <w:b/>
-            <w:bCs/>
+            <w:rStyle w:val="Hipervnculo"/>
             <w:noProof/>
-            <w:lang w:val="es-ES"/>
           </w:rPr>
-          <w:t>No se encuentran elementos de tabla de ilustraciones.</w:t>
+          <w:t>Ilustración 1. Conteo de los registros EFLAG y FLAG</w:t>
         </w:r>
-      </w:fldSimple>
+        <w:r>
+          <w:rPr>
+            <w:noProof/>
+            <w:webHidden/>
+          </w:rPr>
+          <w:tab/>
+        </w:r>
+        <w:r>
+          <w:rPr>
+            <w:noProof/>
+            <w:webHidden/>
+          </w:rPr>
+          <w:fldChar w:fldCharType="begin"/>
+        </w:r>
+        <w:r>
+          <w:rPr>
+            <w:noProof/>
+            <w:webHidden/>
+          </w:rPr>
+          <w:instrText xml:space="preserve"> PAGEREF _Toc238505575 \h </w:instrText>
+        </w:r>
+        <w:r>
+          <w:rPr>
+            <w:noProof/>
+            <w:webHidden/>
+          </w:rPr>
+        </w:r>
+        <w:r>
+          <w:rPr>
+            <w:noProof/>
+            <w:webHidden/>
+          </w:rPr>
+          <w:fldChar w:fldCharType="separate"/>
+        </w:r>
+        <w:r>
+          <w:rPr>
+            <w:noProof/>
+            <w:webHidden/>
+          </w:rPr>
+          <w:t>3</w:t>
+        </w:r>
+        <w:r>
+          <w:rPr>
+            <w:noProof/>
+            <w:webHidden/>
+          </w:rPr>
+          <w:fldChar w:fldCharType="end"/>
+        </w:r>
+      </w:hyperlink>
     </w:p>
-    <w:p/>
     <w:p>
+      <w:r>
+        <w:rPr>
+          <w:b/>
+          <w:bCs/>
+          <w:noProof/>
+          <w:lang w:val="es-ES"/>
+        </w:rPr>
+        <w:fldChar w:fldCharType="end"/>
+      </w:r>
+    </w:p>
+    <w:p>
       <w:pPr>
         <w:pStyle w:val="Ttulo1"/>
       </w:pPr>
+      <w:bookmarkStart w:id="2" w:name="_Toc238505594"/>
       <w:r>
         <w:t>El modelo de programación</w:t>
       </w:r>
+      <w:bookmarkEnd w:id="2"/>
     </w:p>
     <w:p>
       <w:pPr>
@@ -1951,19 +2377,7 @@
         </w:numPr>
       </w:pPr>
       <w:r>
-        <w:t xml:space="preserve">En la base de 8 bits los registros son </w:t>
-      </w:r>
-      <w:r>
-        <w:t>AH,</w:t>
-      </w:r>
-      <w:r>
-        <w:t xml:space="preserve"> </w:t>
-      </w:r>
-      <w:r>
-        <w:t>AL, BH, BL, CH, CL, DH y DL</w:t>
-      </w:r>
-      <w:r>
-        <w:t xml:space="preserve">. </w:t>
+        <w:t xml:space="preserve">En la base de 8 bits los registros son AH, AL, BH, BL, CH, CL, DH y DL. </w:t>
       </w:r>
     </w:p>
     <w:p>
@@ -1993,6 +2407,7 @@
         </w:numPr>
       </w:pPr>
       <w:r>
+        <w:lastRenderedPageBreak/>
         <w:t xml:space="preserve">Y para los 32 bits </w:t>
       </w:r>
       <w:r>
@@ -2003,18 +2418,21 @@
       <w:pPr>
         <w:pStyle w:val="Ttulo1"/>
       </w:pPr>
-      <w:r>
-        <w:lastRenderedPageBreak/>
+      <w:bookmarkStart w:id="3" w:name="_Toc238505595"/>
+      <w:r>
         <w:t>Registros</w:t>
       </w:r>
+      <w:bookmarkEnd w:id="3"/>
     </w:p>
     <w:p>
       <w:pPr>
         <w:pStyle w:val="Ttulo2"/>
       </w:pPr>
+      <w:bookmarkStart w:id="4" w:name="_Toc238505596"/>
       <w:r>
         <w:t>Registros Multipropósito</w:t>
       </w:r>
+      <w:bookmarkEnd w:id="4"/>
     </w:p>
     <w:p>
       <w:pPr>
@@ -2025,7 +2443,22 @@
         </w:numPr>
       </w:pPr>
       <w:r>
-        <w:t>EAX:</w:t>
+        <w:t>EAX</w:t>
+      </w:r>
+      <w:r>
+        <w:t xml:space="preserve"> (Acumulador)</w:t>
+      </w:r>
+      <w:r>
+        <w:t>:</w:t>
+      </w:r>
+      <w:r>
+        <w:t xml:space="preserve"> Los siguientes registros tienen la característica de que se les puede referenciar como 32 bits, uno de 16 bits u dos de 8 bits. Es considerado un registro </w:t>
+      </w:r>
+      <w:r>
+        <w:t>multipropósito,</w:t>
+      </w:r>
+      <w:r>
+        <w:t xml:space="preserve"> pero uno de sus usos principales es para realizar divisiones, multiplicaciones o instrucciones de ajuste.</w:t>
       </w:r>
     </w:p>
     <w:p>
@@ -2039,6 +2472,12 @@
       <w:r>
         <w:t>EBX</w:t>
       </w:r>
+      <w:r>
+        <w:t xml:space="preserve"> (Índice base): Suele guardar la dirección de desplazamiento de una posición en el sistema de memoria y lo hace para todas las versiones de procesadores.</w:t>
+      </w:r>
+      <w:r>
+        <w:t xml:space="preserve"> Para la versión de 32 bits también direcciona datos de la memoria.</w:t>
+      </w:r>
     </w:p>
     <w:p>
       <w:pPr>
@@ -2049,7 +2488,28 @@
         </w:numPr>
       </w:pPr>
       <w:r>
-        <w:t>ECX:</w:t>
+        <w:t>ECX</w:t>
+      </w:r>
+      <w:r>
+        <w:t xml:space="preserve"> </w:t>
+      </w:r>
+      <w:r>
+        <w:t>(</w:t>
+      </w:r>
+      <w:r>
+        <w:t>Conteo</w:t>
+      </w:r>
+      <w:r>
+        <w:t>)</w:t>
+      </w:r>
+      <w:r>
+        <w:t>:</w:t>
+      </w:r>
+      <w:r>
+        <w:t xml:space="preserve"> Guarda la cuenta de varias instruccione</w:t>
+      </w:r>
+      <w:r>
+        <w:t>s. Las instrucciones desplazamiento y rotaciones utilizan CL como el conteo, las de cadena repetida utilizan CX y las instrucciones LOOP/LOOPD utilizan CX o ECX.</w:t>
       </w:r>
     </w:p>
     <w:p>
@@ -2061,7 +2521,16 @@
         </w:numPr>
       </w:pPr>
       <w:r>
-        <w:t>EDX:</w:t>
+        <w:t>EDX</w:t>
+      </w:r>
+      <w:r>
+        <w:t xml:space="preserve"> (Datos)</w:t>
+      </w:r>
+      <w:r>
+        <w:t>:</w:t>
+      </w:r>
+      <w:r>
+        <w:t xml:space="preserve"> Guarda una parte de una multiplicación o parte del dividendo en una división. En sistemas de 32 bits también puede direccionar datos de la memoria.</w:t>
       </w:r>
     </w:p>
     <w:p>
@@ -2073,7 +2542,16 @@
         </w:numPr>
       </w:pPr>
       <w:r>
-        <w:t>EBP:</w:t>
+        <w:t>EBP</w:t>
+      </w:r>
+      <w:r>
+        <w:t xml:space="preserve"> (Apuntador de la base)</w:t>
+      </w:r>
+      <w:r>
+        <w:t>:</w:t>
+      </w:r>
+      <w:r>
+        <w:t xml:space="preserve"> Apunta a una posición de memoria en todas las versiones del microprocesador para realizar trasferencia de datos en la memoria.</w:t>
       </w:r>
     </w:p>
     <w:p>
@@ -2085,7 +2563,19 @@
         </w:numPr>
       </w:pPr>
       <w:r>
-        <w:t>EDI:</w:t>
+        <w:t>EDI</w:t>
+      </w:r>
+      <w:r>
+        <w:t xml:space="preserve"> (Índice de destino)</w:t>
+      </w:r>
+      <w:r>
+        <w:t>:</w:t>
+      </w:r>
+      <w:r>
+        <w:t xml:space="preserve"> </w:t>
+      </w:r>
+      <w:r>
+        <w:t>Usualmente se encarga de direccionar los datos de destino de tipo de cadena para las instrucciones específicas de cadenas. Se comporta como multipropósito desde los 16 bits a 32 bits.</w:t>
       </w:r>
     </w:p>
     <w:p>
@@ -2097,16 +2587,27 @@
         </w:numPr>
       </w:pPr>
       <w:r>
-        <w:t>ESI:</w:t>
+        <w:t>ESI</w:t>
+      </w:r>
+      <w:r>
+        <w:t xml:space="preserve"> (Índice de origen)</w:t>
+      </w:r>
+      <w:r>
+        <w:t>:</w:t>
+      </w:r>
+      <w:r>
+        <w:t xml:space="preserve"> El registro de origen direcciona datos de cadena de origen para las instrucciones de cadena.</w:t>
       </w:r>
     </w:p>
     <w:p>
       <w:pPr>
         <w:pStyle w:val="Ttulo2"/>
       </w:pPr>
+      <w:bookmarkStart w:id="5" w:name="_Toc238505597"/>
       <w:r>
         <w:t>Registros de Propósito Especial</w:t>
       </w:r>
+      <w:bookmarkEnd w:id="5"/>
     </w:p>
     <w:p>
       <w:pPr>
@@ -2117,7 +2618,16 @@
         </w:numPr>
       </w:pPr>
       <w:r>
-        <w:t>IEP:</w:t>
+        <w:t>IEP</w:t>
+      </w:r>
+      <w:r>
+        <w:t xml:space="preserve"> (Apuntador de instrucciones)</w:t>
+      </w:r>
+      <w:r>
+        <w:t>:</w:t>
+      </w:r>
+      <w:r>
+        <w:t xml:space="preserve"> direcciona la siguiente instrucción en una sección definida como segmento de código. Se encarga de apuntar a la siguiente instrucción de un programa y lo utiliza el microprocesador para encontrar la siguiente instrucción secuencial dentro del programa. </w:t>
       </w:r>
     </w:p>
     <w:p>
@@ -2129,7 +2639,22 @@
         </w:numPr>
       </w:pPr>
       <w:r>
-        <w:t>ESP:</w:t>
+        <w:t>ESP</w:t>
+      </w:r>
+      <w:r>
+        <w:t xml:space="preserve"> (Apuntad</w:t>
+      </w:r>
+      <w:r>
+        <w:t>o</w:t>
+      </w:r>
+      <w:r>
+        <w:t>r de la pila)</w:t>
+      </w:r>
+      <w:r>
+        <w:t>:</w:t>
+      </w:r>
+      <w:r>
+        <w:t xml:space="preserve"> Direcciona un área de la memoria llamada pila la cual almacena datos a través de este apuntador.</w:t>
       </w:r>
     </w:p>
     <w:p>
@@ -2141,8 +2666,119 @@
         </w:numPr>
       </w:pPr>
       <w:r>
-        <w:t>EFLAGS:</w:t>
-      </w:r>
+        <w:t>EFLAGS</w:t>
+      </w:r>
+      <w:r>
+        <w:t xml:space="preserve"> (banderas)</w:t>
+      </w:r>
+      <w:r>
+        <w:t>:</w:t>
+      </w:r>
+      <w:r>
+        <w:t xml:space="preserve"> Este se encarga de indicar la condición del microprocesador y controla su operación, se compone de varias capas las cuales crecen a medida que los microprocesadores avanzaron.</w:t>
+      </w:r>
+    </w:p>
+    <w:p>
+      <w:pPr>
+        <w:pStyle w:val="Ttulo2"/>
+      </w:pPr>
+      <w:bookmarkStart w:id="6" w:name="_Toc238505598"/>
+      <w:r>
+        <w:lastRenderedPageBreak/>
+        <w:t>Registros de Segmento</w:t>
+      </w:r>
+      <w:bookmarkEnd w:id="6"/>
+    </w:p>
+    <w:p>
+      <w:pPr>
+        <w:pStyle w:val="Prrafodelista"/>
+        <w:numPr>
+          <w:ilvl w:val="0"/>
+          <w:numId w:val="36"/>
+        </w:numPr>
+      </w:pPr>
+      <w:r>
+        <w:t>CS (código):</w:t>
+      </w:r>
+      <w:r>
+        <w:t xml:space="preserve"> Guarda el código utilizado por el microprocesador. Este define la dirección de inicial de la sección de memoria que guarda el código.</w:t>
+      </w:r>
+    </w:p>
+    <w:p>
+      <w:pPr>
+        <w:pStyle w:val="Prrafodelista"/>
+        <w:numPr>
+          <w:ilvl w:val="0"/>
+          <w:numId w:val="36"/>
+        </w:numPr>
+      </w:pPr>
+      <w:r>
+        <w:t>DS (datos):</w:t>
+      </w:r>
+      <w:r>
+        <w:t xml:space="preserve"> Una sección de memoria que contiene la mayor parte de los datos utilizados por un programa. Se accede a los datos por medio de una dirección</w:t>
+      </w:r>
+      <w:r>
+        <w:t xml:space="preserve"> </w:t>
+      </w:r>
+      <w:r>
+        <w:t>de desplazamiento o el contenido de otros registros que guardan la dirección de desplazamiento.</w:t>
+      </w:r>
+    </w:p>
+    <w:p>
+      <w:pPr>
+        <w:pStyle w:val="Prrafodelista"/>
+        <w:numPr>
+          <w:ilvl w:val="0"/>
+          <w:numId w:val="36"/>
+        </w:numPr>
+      </w:pPr>
+      <w:r>
+        <w:t>ES (extra):</w:t>
+      </w:r>
+      <w:r>
+        <w:t xml:space="preserve"> Es un segmento de datos adicional utilizado por algunas instrucciones de cadena para guardar datos de destino.</w:t>
+      </w:r>
+    </w:p>
+    <w:p>
+      <w:pPr>
+        <w:pStyle w:val="Prrafodelista"/>
+        <w:numPr>
+          <w:ilvl w:val="0"/>
+          <w:numId w:val="36"/>
+        </w:numPr>
+      </w:pPr>
+      <w:r>
+        <w:t>SS (pila):</w:t>
+      </w:r>
+      <w:r>
+        <w:t xml:space="preserve"> Define el área de memoria utilizada para la pila. Su punto de entrada se determina mediante los registros segmento de pila y su apuntador. El registro BP también direcciona datos dentro del segmento de pila.</w:t>
+      </w:r>
+    </w:p>
+    <w:p>
+      <w:pPr>
+        <w:pStyle w:val="Prrafodelista"/>
+        <w:numPr>
+          <w:ilvl w:val="0"/>
+          <w:numId w:val="36"/>
+        </w:numPr>
+      </w:pPr>
+      <w:r>
+        <w:t xml:space="preserve">FS y GS:  </w:t>
+      </w:r>
+      <w:r>
+        <w:t>Se tratan de registros de segmentos suplementarios, que solo están disponibles en los microprocesadores del 80386 al Pentium 4 para los programas puedan acceder a dos segmentos de memoria adicionales. Por ejemplo, Windows utiliza estos segmentos para operaciones internas, pero no hay disponible una definición de su uso.</w:t>
+      </w:r>
+    </w:p>
+    <w:p>
+      <w:pPr>
+        <w:pStyle w:val="Ttulo2"/>
+      </w:pPr>
+      <w:bookmarkStart w:id="7" w:name="_Toc238505599"/>
+      <w:r>
+        <w:t>Desglose de Bits del registro EFLAGS</w:t>
+      </w:r>
+      <w:bookmarkEnd w:id="7"/>
     </w:p>
     <w:p>
       <w:pPr>
@@ -2153,7 +2789,10 @@
         </w:numPr>
       </w:pPr>
       <w:r>
-        <w:t>C:</w:t>
+        <w:t>C (Acarreo):</w:t>
+      </w:r>
+      <w:r>
+        <w:t xml:space="preserve"> Guarda el valor del acarreo después de una adición o sustracción y también indica condiciones de error, según lo indiquen algunos procesos o programas.</w:t>
       </w:r>
     </w:p>
     <w:p>
@@ -2165,7 +2804,10 @@
         </w:numPr>
       </w:pPr>
       <w:r>
-        <w:t>P:</w:t>
+        <w:t>P (Paridad):</w:t>
+      </w:r>
+      <w:r>
+        <w:t xml:space="preserve"> La paridad es un 0 lógico para paridad impar y un 1 lógico para paridad par. Y se trata del conteo de los unos en un número expresado como par o impar.</w:t>
       </w:r>
     </w:p>
     <w:p>
@@ -2177,7 +2819,10 @@
         </w:numPr>
       </w:pPr>
       <w:r>
-        <w:t>A:</w:t>
+        <w:t>A (Acarreo auxiliar):</w:t>
+      </w:r>
+      <w:r>
+        <w:t xml:space="preserve"> Guarda el acarreo después de la adición o la sustracción entre las posiciones de bit 3 y 4 del resultado. Este bit altamente especializado lo comprueban las instrucciones DAA y DAS para ajustar el valor de AL después de una suma o resta BCD. </w:t>
       </w:r>
     </w:p>
     <w:p>
@@ -2189,7 +2834,10 @@
         </w:numPr>
       </w:pPr>
       <w:r>
-        <w:t>Z:</w:t>
+        <w:t>Z (Cero):</w:t>
+      </w:r>
+      <w:r>
+        <w:t xml:space="preserve"> Indica el resultado de una operación aritmética o lógica es cero. Si Z = 1, el resultado es cero; si Z = 0, el resultado no es cero.</w:t>
       </w:r>
     </w:p>
     <w:p>
@@ -2201,7 +2849,10 @@
         </w:numPr>
       </w:pPr>
       <w:r>
-        <w:t>S:</w:t>
+        <w:t>S (Signo):</w:t>
+      </w:r>
+      <w:r>
+        <w:t xml:space="preserve"> Guarda el signo aritmético del resultado después de la ejecución de una instrucción aritmética o lógica. Si S = 1, el bit de signo está activado o es negativo; si S = 0, el bit de signo está desactivado o es positivo.</w:t>
       </w:r>
     </w:p>
     <w:p>
@@ -2213,7 +2864,10 @@
         </w:numPr>
       </w:pPr>
       <w:r>
-        <w:t>T:</w:t>
+        <w:t>T (Trampa):</w:t>
+      </w:r>
+      <w:r>
+        <w:t xml:space="preserve"> Habilita el atrapamiento a través de una característica de depuración integrada en el chip. Si T = 1, el microprocesador interrumpe el flujo del programa basándose en las condiciones indicadas por los registros de depuración y los registros de control. Si T = 0 entonces se deshabilita la característica de depuración.</w:t>
       </w:r>
     </w:p>
     <w:p>
@@ -2225,7 +2879,11 @@
         </w:numPr>
       </w:pPr>
       <w:r>
-        <w:t>I:</w:t>
+        <w:lastRenderedPageBreak/>
+        <w:t>I (Interrupción):</w:t>
+      </w:r>
+      <w:r>
+        <w:t xml:space="preserve"> Controla la operación de la terminal de entrada. Si I = 1, se habilita la termina INTR, si I = 0 entonces se deshabilita. El estado del bit se controla mediante las instrucciones STI y CLI.</w:t>
       </w:r>
     </w:p>
     <w:p>
@@ -2237,7 +2895,10 @@
         </w:numPr>
       </w:pPr>
       <w:r>
-        <w:t>D:</w:t>
+        <w:t>D (Dirección):</w:t>
+      </w:r>
+      <w:r>
+        <w:t xml:space="preserve"> </w:t>
       </w:r>
     </w:p>
     <w:p>
@@ -2249,7 +2910,7 @@
         </w:numPr>
       </w:pPr>
       <w:r>
-        <w:t>O:</w:t>
+        <w:t>O (Desbordamiento):</w:t>
       </w:r>
     </w:p>
     <w:p>
@@ -2261,7 +2922,7 @@
         </w:numPr>
       </w:pPr>
       <w:r>
-        <w:t>IOPL:</w:t>
+        <w:t>IOPL (Nivel de privilegio de E/S):</w:t>
       </w:r>
     </w:p>
     <w:p>
@@ -2273,7 +2934,7 @@
         </w:numPr>
       </w:pPr>
       <w:r>
-        <w:t>NT:</w:t>
+        <w:t>NT (Tarea anidada):</w:t>
       </w:r>
     </w:p>
     <w:p>
@@ -2285,7 +2946,7 @@
         </w:numPr>
       </w:pPr>
       <w:r>
-        <w:t>RF:</w:t>
+        <w:t>RF (Continuación):</w:t>
       </w:r>
     </w:p>
     <w:p>
@@ -2296,39 +2957,170 @@
           <w:numId w:val="35"/>
         </w:numPr>
       </w:pPr>
+      <w:r>
+        <w:t>VM (Modo virtual):</w:t>
+      </w:r>
     </w:p>
     <w:p>
-      <w:r>
-        <w:tab/>
+      <w:pPr>
+        <w:pStyle w:val="Prrafodelista"/>
+        <w:numPr>
+          <w:ilvl w:val="0"/>
+          <w:numId w:val="35"/>
+        </w:numPr>
+      </w:pPr>
+      <w:r>
+        <w:t>AC (comprobación de alineación):</w:t>
       </w:r>
     </w:p>
     <w:p>
       <w:pPr>
-        <w:pStyle w:val="Ttulo1"/>
-      </w:pPr>
-      <w:bookmarkStart w:id="2" w:name="_Toc220850612"/>
-      <w:r>
-        <w:t>Conclusión</w:t>
-      </w:r>
-      <w:bookmarkEnd w:id="2"/>
+        <w:pStyle w:val="Prrafodelista"/>
+        <w:numPr>
+          <w:ilvl w:val="0"/>
+          <w:numId w:val="35"/>
+        </w:numPr>
+      </w:pPr>
+      <w:r>
+        <w:t>VIF (Interrupción virtual):</w:t>
+      </w:r>
     </w:p>
     <w:p>
       <w:pPr>
-        <w:spacing w:before="120" w:after="0"/>
-      </w:pPr>
-      <w:r>
-        <w:t>Hola soy una conclusión</w:t>
+        <w:pStyle w:val="Prrafodelista"/>
+        <w:numPr>
+          <w:ilvl w:val="0"/>
+          <w:numId w:val="35"/>
+        </w:numPr>
+      </w:pPr>
+      <w:r>
+        <w:t>VIP (interrupción virtual pendiente):</w:t>
       </w:r>
     </w:p>
     <w:p>
       <w:pPr>
+        <w:pStyle w:val="Prrafodelista"/>
+        <w:numPr>
+          <w:ilvl w:val="0"/>
+          <w:numId w:val="35"/>
+        </w:numPr>
+      </w:pPr>
+      <w:r>
+        <w:t>ID (identificación):</w:t>
+      </w:r>
+    </w:p>
+    <w:p>
+      <w:pPr>
+        <w:keepNext/>
+      </w:pPr>
+      <w:r>
+        <w:rPr>
+          <w:noProof/>
+        </w:rPr>
+        <w:drawing>
+          <wp:inline distT="0" distB="0" distL="0" distR="0" wp14:anchorId="0AC376FA" wp14:editId="72504B03">
+            <wp:extent cx="5791835" cy="2150110"/>
+            <wp:effectExtent l="0" t="0" r="0" b="2540"/>
+            <wp:docPr id="1364614326" name="Imagen 7" descr="Arsitektur dan Organisasi Komputer : Arsitektur Intel x86"/>
+            <wp:cNvGraphicFramePr>
+              <a:graphicFrameLocks xmlns:a="http://schemas.openxmlformats.org/drawingml/2006/main" noChangeAspect="1"/>
+            </wp:cNvGraphicFramePr>
+            <a:graphic xmlns:a="http://schemas.openxmlformats.org/drawingml/2006/main">
+              <a:graphicData uri="http://schemas.openxmlformats.org/drawingml/2006/picture">
+                <pic:pic xmlns:pic="http://schemas.openxmlformats.org/drawingml/2006/picture">
+                  <pic:nvPicPr>
+                    <pic:cNvPr id="0" name="Picture 1" descr="Arsitektur dan Organisasi Komputer : Arsitektur Intel x86"/>
+                    <pic:cNvPicPr>
+                      <a:picLocks noChangeAspect="1" noChangeArrowheads="1"/>
+                    </pic:cNvPicPr>
+                  </pic:nvPicPr>
+                  <pic:blipFill>
+                    <a:blip r:embed="rId12">
+                      <a:extLst>
+                        <a:ext uri="{28A0092B-C50C-407E-A947-70E740481C1C}">
+                          <a14:useLocalDpi xmlns:a14="http://schemas.microsoft.com/office/drawing/2010/main" val="0"/>
+                        </a:ext>
+                      </a:extLst>
+                    </a:blip>
+                    <a:srcRect/>
+                    <a:stretch>
+                      <a:fillRect/>
+                    </a:stretch>
+                  </pic:blipFill>
+                  <pic:spPr bwMode="auto">
+                    <a:xfrm>
+                      <a:off x="0" y="0"/>
+                      <a:ext cx="5791835" cy="2150110"/>
+                    </a:xfrm>
+                    <a:prstGeom prst="rect">
+                      <a:avLst/>
+                    </a:prstGeom>
+                    <a:noFill/>
+                    <a:ln>
+                      <a:noFill/>
+                    </a:ln>
+                  </pic:spPr>
+                </pic:pic>
+              </a:graphicData>
+            </a:graphic>
+          </wp:inline>
+        </w:drawing>
+      </w:r>
+    </w:p>
+    <w:p>
+      <w:pPr>
+        <w:pStyle w:val="Descripcin"/>
+        <w:jc w:val="center"/>
+      </w:pPr>
+      <w:bookmarkStart w:id="8" w:name="_Toc238505575"/>
+      <w:r>
+        <w:t xml:space="preserve">Ilustración </w:t>
+      </w:r>
+      <w:fldSimple w:instr=" SEQ Ilustración \* ARABIC ">
+        <w:r>
+          <w:rPr>
+            <w:noProof/>
+          </w:rPr>
+          <w:t>1</w:t>
+        </w:r>
+      </w:fldSimple>
+      <w:r>
+        <w:t>. Conteo de los registros EFLAG y FLAG</w:t>
+      </w:r>
+      <w:bookmarkEnd w:id="8"/>
+    </w:p>
+    <w:p>
+      <w:r>
+        <w:tab/>
+      </w:r>
+    </w:p>
+    <w:p>
+      <w:pPr>
         <w:pStyle w:val="Ttulo1"/>
       </w:pPr>
-      <w:bookmarkStart w:id="3" w:name="_Toc220850613"/>
+      <w:bookmarkStart w:id="9" w:name="_Toc238505600"/>
+      <w:r>
+        <w:t>Conclusión</w:t>
+      </w:r>
+      <w:bookmarkEnd w:id="9"/>
+    </w:p>
+    <w:p>
+      <w:pPr>
+        <w:spacing w:before="120" w:after="0"/>
+      </w:pPr>
+      <w:r>
+        <w:t>Hola soy una conclusión</w:t>
+      </w:r>
+    </w:p>
+    <w:p>
+      <w:pPr>
+        <w:pStyle w:val="Ttulo1"/>
+      </w:pPr>
+      <w:bookmarkStart w:id="10" w:name="_Toc238505601"/>
       <w:r>
         <w:t>Bibliografía</w:t>
       </w:r>
-      <w:bookmarkEnd w:id="3"/>
+      <w:bookmarkEnd w:id="10"/>
     </w:p>
     <w:p>
       <w:r>
@@ -2346,10 +3138,10 @@
     <w:p/>
     <w:p/>
     <w:sectPr>
-      <w:headerReference w:type="even" r:id="rId12"/>
-      <w:headerReference w:type="default" r:id="rId13"/>
-      <w:footerReference w:type="even" r:id="rId14"/>
-      <w:footerReference w:type="default" r:id="rId15"/>
+      <w:headerReference w:type="even" r:id="rId13"/>
+      <w:headerReference w:type="default" r:id="rId14"/>
+      <w:footerReference w:type="even" r:id="rId15"/>
+      <w:footerReference w:type="default" r:id="rId16"/>
       <w:pgSz w:w="12240" w:h="15840"/>
       <w:pgMar w:top="1418" w:right="1134" w:bottom="1418" w:left="1701" w:header="720" w:footer="720" w:gutter="284"/>
       <w:pgBorders w:offsetFrom="page">
@@ -5670,6 +6462,119 @@
     </w:lvl>
   </w:abstractNum>
   <w:abstractNum w:abstractNumId="29" w15:restartNumberingAfterBreak="0">
+    <w:nsid w:val="65C1777E"/>
+    <w:multiLevelType w:val="hybridMultilevel"/>
+    <w:tmpl w:val="EAEC0930"/>
+    <w:lvl w:ilvl="0" w:tplc="080A0001">
+      <w:start w:val="1"/>
+      <w:numFmt w:val="bullet"/>
+      <w:lvlText w:val=""/>
+      <w:lvlJc w:val="left"/>
+      <w:pPr>
+        <w:ind w:left="720" w:hanging="360"/>
+      </w:pPr>
+      <w:rPr>
+        <w:rFonts w:ascii="Symbol" w:hAnsi="Symbol" w:hint="default"/>
+      </w:rPr>
+    </w:lvl>
+    <w:lvl w:ilvl="1" w:tplc="080A0003" w:tentative="1">
+      <w:start w:val="1"/>
+      <w:numFmt w:val="bullet"/>
+      <w:lvlText w:val="o"/>
+      <w:lvlJc w:val="left"/>
+      <w:pPr>
+        <w:ind w:left="1440" w:hanging="360"/>
+      </w:pPr>
+      <w:rPr>
+        <w:rFonts w:ascii="Courier New" w:hAnsi="Courier New" w:cs="Courier New" w:hint="default"/>
+      </w:rPr>
+    </w:lvl>
+    <w:lvl w:ilvl="2" w:tplc="080A0005" w:tentative="1">
+      <w:start w:val="1"/>
+      <w:numFmt w:val="bullet"/>
+      <w:lvlText w:val=""/>
+      <w:lvlJc w:val="left"/>
+      <w:pPr>
+        <w:ind w:left="2160" w:hanging="360"/>
+      </w:pPr>
+      <w:rPr>
+        <w:rFonts w:ascii="Wingdings" w:hAnsi="Wingdings" w:hint="default"/>
+      </w:rPr>
+    </w:lvl>
+    <w:lvl w:ilvl="3" w:tplc="080A0001" w:tentative="1">
+      <w:start w:val="1"/>
+      <w:numFmt w:val="bullet"/>
+      <w:lvlText w:val=""/>
+      <w:lvlJc w:val="left"/>
+      <w:pPr>
+        <w:ind w:left="2880" w:hanging="360"/>
+      </w:pPr>
+      <w:rPr>
+        <w:rFonts w:ascii="Symbol" w:hAnsi="Symbol" w:hint="default"/>
+      </w:rPr>
+    </w:lvl>
+    <w:lvl w:ilvl="4" w:tplc="080A0003" w:tentative="1">
+      <w:start w:val="1"/>
+      <w:numFmt w:val="bullet"/>
+      <w:lvlText w:val="o"/>
+      <w:lvlJc w:val="left"/>
+      <w:pPr>
+        <w:ind w:left="3600" w:hanging="360"/>
+      </w:pPr>
+      <w:rPr>
+        <w:rFonts w:ascii="Courier New" w:hAnsi="Courier New" w:cs="Courier New" w:hint="default"/>
+      </w:rPr>
+    </w:lvl>
+    <w:lvl w:ilvl="5" w:tplc="080A0005" w:tentative="1">
+      <w:start w:val="1"/>
+      <w:numFmt w:val="bullet"/>
+      <w:lvlText w:val=""/>
+      <w:lvlJc w:val="left"/>
+      <w:pPr>
+        <w:ind w:left="4320" w:hanging="360"/>
+      </w:pPr>
+      <w:rPr>
+        <w:rFonts w:ascii="Wingdings" w:hAnsi="Wingdings" w:hint="default"/>
+      </w:rPr>
+    </w:lvl>
+    <w:lvl w:ilvl="6" w:tplc="080A0001" w:tentative="1">
+      <w:start w:val="1"/>
+      <w:numFmt w:val="bullet"/>
+      <w:lvlText w:val=""/>
+      <w:lvlJc w:val="left"/>
+      <w:pPr>
+        <w:ind w:left="5040" w:hanging="360"/>
+      </w:pPr>
+      <w:rPr>
+        <w:rFonts w:ascii="Symbol" w:hAnsi="Symbol" w:hint="default"/>
+      </w:rPr>
+    </w:lvl>
+    <w:lvl w:ilvl="7" w:tplc="080A0003" w:tentative="1">
+      <w:start w:val="1"/>
+      <w:numFmt w:val="bullet"/>
+      <w:lvlText w:val="o"/>
+      <w:lvlJc w:val="left"/>
+      <w:pPr>
+        <w:ind w:left="5760" w:hanging="360"/>
+      </w:pPr>
+      <w:rPr>
+        <w:rFonts w:ascii="Courier New" w:hAnsi="Courier New" w:cs="Courier New" w:hint="default"/>
+      </w:rPr>
+    </w:lvl>
+    <w:lvl w:ilvl="8" w:tplc="080A0005" w:tentative="1">
+      <w:start w:val="1"/>
+      <w:numFmt w:val="bullet"/>
+      <w:lvlText w:val=""/>
+      <w:lvlJc w:val="left"/>
+      <w:pPr>
+        <w:ind w:left="6480" w:hanging="360"/>
+      </w:pPr>
+      <w:rPr>
+        <w:rFonts w:ascii="Wingdings" w:hAnsi="Wingdings" w:hint="default"/>
+      </w:rPr>
+    </w:lvl>
+  </w:abstractNum>
+  <w:abstractNum w:abstractNumId="30" w15:restartNumberingAfterBreak="0">
     <w:nsid w:val="67A32EBF"/>
     <w:multiLevelType w:val="hybridMultilevel"/>
     <w:tmpl w:val="127C7076"/>
@@ -5782,7 +6687,7 @@
       </w:rPr>
     </w:lvl>
   </w:abstractNum>
-  <w:abstractNum w:abstractNumId="30" w15:restartNumberingAfterBreak="0">
+  <w:abstractNum w:abstractNumId="31" w15:restartNumberingAfterBreak="0">
     <w:nsid w:val="6BA55FA5"/>
     <w:multiLevelType w:val="hybridMultilevel"/>
     <w:tmpl w:val="310E65FC"/>
@@ -5895,7 +6800,7 @@
       </w:rPr>
     </w:lvl>
   </w:abstractNum>
-  <w:abstractNum w:abstractNumId="31" w15:restartNumberingAfterBreak="0">
+  <w:abstractNum w:abstractNumId="32" w15:restartNumberingAfterBreak="0">
     <w:nsid w:val="6E6F759E"/>
     <w:multiLevelType w:val="hybridMultilevel"/>
     <w:tmpl w:val="1CA448FC"/>
@@ -6008,7 +6913,7 @@
       </w:rPr>
     </w:lvl>
   </w:abstractNum>
-  <w:abstractNum w:abstractNumId="32" w15:restartNumberingAfterBreak="0">
+  <w:abstractNum w:abstractNumId="33" w15:restartNumberingAfterBreak="0">
     <w:nsid w:val="784530C1"/>
     <w:multiLevelType w:val="hybridMultilevel"/>
     <w:tmpl w:val="3CF6FE18"/>
@@ -6121,7 +7026,7 @@
       </w:rPr>
     </w:lvl>
   </w:abstractNum>
-  <w:abstractNum w:abstractNumId="33" w15:restartNumberingAfterBreak="0">
+  <w:abstractNum w:abstractNumId="34" w15:restartNumberingAfterBreak="0">
     <w:nsid w:val="7C226B17"/>
     <w:multiLevelType w:val="hybridMultilevel"/>
     <w:tmpl w:val="316EBF58"/>
@@ -6234,7 +7139,7 @@
       </w:rPr>
     </w:lvl>
   </w:abstractNum>
-  <w:abstractNum w:abstractNumId="34" w15:restartNumberingAfterBreak="0">
+  <w:abstractNum w:abstractNumId="35" w15:restartNumberingAfterBreak="0">
     <w:nsid w:val="7C7324D3"/>
     <w:multiLevelType w:val="hybridMultilevel"/>
     <w:tmpl w:val="FBB601F2"/>
@@ -6354,10 +7259,10 @@
     <w:abstractNumId w:val="5"/>
   </w:num>
   <w:num w:numId="3" w16cid:durableId="1516307261">
-    <w:abstractNumId w:val="29"/>
+    <w:abstractNumId w:val="30"/>
   </w:num>
   <w:num w:numId="4" w16cid:durableId="263998001">
-    <w:abstractNumId w:val="32"/>
+    <w:abstractNumId w:val="33"/>
   </w:num>
   <w:num w:numId="5" w16cid:durableId="1694530711">
     <w:abstractNumId w:val="4"/>
@@ -6366,10 +7271,10 @@
     <w:abstractNumId w:val="28"/>
   </w:num>
   <w:num w:numId="7" w16cid:durableId="1510755812">
-    <w:abstractNumId w:val="34"/>
+    <w:abstractNumId w:val="35"/>
   </w:num>
   <w:num w:numId="8" w16cid:durableId="401295270">
-    <w:abstractNumId w:val="31"/>
+    <w:abstractNumId w:val="32"/>
   </w:num>
   <w:num w:numId="9" w16cid:durableId="1237131580">
     <w:abstractNumId w:val="17"/>
@@ -6408,7 +7313,7 @@
     <w:abstractNumId w:val="8"/>
   </w:num>
   <w:num w:numId="21" w16cid:durableId="1910534101">
-    <w:abstractNumId w:val="33"/>
+    <w:abstractNumId w:val="34"/>
   </w:num>
   <w:num w:numId="22" w16cid:durableId="124473379">
     <w:abstractNumId w:val="9"/>
@@ -6447,10 +7352,13 @@
     <w:abstractNumId w:val="27"/>
   </w:num>
   <w:num w:numId="34" w16cid:durableId="884833427">
-    <w:abstractNumId w:val="30"/>
+    <w:abstractNumId w:val="31"/>
   </w:num>
   <w:num w:numId="35" w16cid:durableId="497235551">
     <w:abstractNumId w:val="3"/>
+  </w:num>
+  <w:num w:numId="36" w16cid:durableId="1722053768">
+    <w:abstractNumId w:val="29"/>
   </w:num>
   <w:numIdMacAtCleanup w:val="13"/>
 </w:numbering>
@@ -7989,6 +8897,17 @@
       <w:iCs/>
     </w:rPr>
   </w:style>
+  <w:style w:type="paragraph" w:styleId="Tabladeilustraciones">
+    <w:name w:val="table of figures"/>
+    <w:basedOn w:val="Normal"/>
+    <w:next w:val="Normal"/>
+    <w:uiPriority w:val="99"/>
+    <w:unhideWhenUsed/>
+    <w:rsid w:val="0019128E"/>
+    <w:pPr>
+      <w:spacing w:after="0"/>
+    </w:pPr>
+  </w:style>
 </w:styles>
 </file>
 

</xml_diff>

<commit_message>
lap -> PC: Bajo Nivel
</commit_message>
<xml_diff>
--- a/TAREAS 6 SEMESTRE/Programación Bajo Nivel/QuijasContrerasAct1.docx
+++ b/TAREAS 6 SEMESTRE/Programación Bajo Nivel/QuijasContrerasAct1.docx
@@ -2136,7 +2136,7 @@
                 <w:noProof/>
                 <w:webHidden/>
               </w:rPr>
-              <w:t>4</w:t>
+              <w:t>5</w:t>
             </w:r>
             <w:r>
               <w:rPr>
@@ -2206,7 +2206,7 @@
                 <w:noProof/>
                 <w:webHidden/>
               </w:rPr>
-              <w:t>4</w:t>
+              <w:t>5</w:t>
             </w:r>
             <w:r>
               <w:rPr>
@@ -2305,7 +2305,7 @@
             <w:noProof/>
             <w:webHidden/>
           </w:rPr>
-          <w:t>3</w:t>
+          <w:t>4</w:t>
         </w:r>
         <w:r>
           <w:rPr>
@@ -2900,6 +2900,9 @@
       <w:r>
         <w:t xml:space="preserve"> </w:t>
       </w:r>
+      <w:r>
+        <w:t>Selecciona el modo de incremento o de decremento para los registros DI y/o SI durante las instrucciones de cadena. S D = 1, los registros se decrementan automáticamente. Si D = 0, se incrementan automáticamente.</w:t>
+      </w:r>
     </w:p>
     <w:p>
       <w:pPr>
@@ -2912,6 +2915,9 @@
       <w:r>
         <w:t>O (Desbordamiento):</w:t>
       </w:r>
+      <w:r>
+        <w:t xml:space="preserve"> Indica si el resultado ha excedido la capacidad de la máquina. </w:t>
+      </w:r>
     </w:p>
     <w:p>
       <w:pPr>
@@ -2924,6 +2930,9 @@
       <w:r>
         <w:t>IOPL (Nivel de privilegio de E/S):</w:t>
       </w:r>
+      <w:r>
+        <w:t xml:space="preserve"> Se utiliza en modo protegido para seleccionar el nivel de privilegio para los dispositivos de E/S. Si el nivel de privilegio es de igual o mayor confianza que el IOPL, la operación se ejecuta, si no, se produce una interrupción.</w:t>
+      </w:r>
     </w:p>
     <w:p>
       <w:pPr>
@@ -2936,6 +2945,9 @@
       <w:r>
         <w:t>NT (Tarea anidada):</w:t>
       </w:r>
+      <w:r>
+        <w:t xml:space="preserve"> Indica que la tarea está anidada a otra tarea.</w:t>
+      </w:r>
     </w:p>
     <w:p>
       <w:pPr>
@@ -2948,6 +2960,9 @@
       <w:r>
         <w:t>RF (Continuación):</w:t>
       </w:r>
+      <w:r>
+        <w:t xml:space="preserve"> se utiliza con la depuración para controlar la continuación de la ejecución después de la siguiente instrucción.</w:t>
+      </w:r>
     </w:p>
     <w:p>
       <w:pPr>
@@ -2960,6 +2975,12 @@
       <w:r>
         <w:t>VM (Modo virtual):</w:t>
       </w:r>
+      <w:r>
+        <w:t xml:space="preserve"> </w:t>
+      </w:r>
+      <w:r>
+        <w:t>selecciona la operación en modo virtual en un sistema de modo protegido.</w:t>
+      </w:r>
     </w:p>
     <w:p>
       <w:pPr>
@@ -2972,6 +2993,9 @@
       <w:r>
         <w:t>AC (comprobación de alineación):</w:t>
       </w:r>
+      <w:r>
+        <w:t xml:space="preserve"> Se activa si se direcciona una palabra o doble palabra en un límite que no sea de palabra o de doble palabra.</w:t>
+      </w:r>
     </w:p>
     <w:p>
       <w:pPr>
@@ -2984,6 +3008,9 @@
       <w:r>
         <w:t>VIF (Interrupción virtual):</w:t>
       </w:r>
+      <w:r>
+        <w:t xml:space="preserve"> es una copia del bit de interrupción.</w:t>
+      </w:r>
     </w:p>
     <w:p>
       <w:pPr>
@@ -2996,6 +3023,9 @@
       <w:r>
         <w:t>VIP (interrupción virtual pendiente):</w:t>
       </w:r>
+      <w:r>
+        <w:t xml:space="preserve"> Proporciona información sobre una interrupción en modo virtual. Proporciona banderas de interrupción virtual al sistema, además de interrupciones pendientes.</w:t>
+      </w:r>
     </w:p>
     <w:p>
       <w:pPr>
@@ -3007,6 +3037,18 @@
       </w:pPr>
       <w:r>
         <w:t>ID (identificación):</w:t>
+      </w:r>
+      <w:r>
+        <w:t xml:space="preserve"> Indica si el procesador soporta la instrucción CPUID. Solo disponible para el microprocesador Pentium y proporciona su </w:t>
+      </w:r>
+      <w:r>
+        <w:rPr>
+          <w:u w:val="single"/>
+        </w:rPr>
+        <w:t>número</w:t>
+      </w:r>
+      <w:r>
+        <w:t xml:space="preserve"> de versión y el fabricante.</w:t>
       </w:r>
     </w:p>
     <w:p>
@@ -3100,6 +3142,7 @@
       </w:pPr>
       <w:bookmarkStart w:id="9" w:name="_Toc238505600"/>
       <w:r>
+        <w:lastRenderedPageBreak/>
         <w:t>Conclusión</w:t>
       </w:r>
       <w:bookmarkEnd w:id="9"/>
@@ -3109,7 +3152,8 @@
         <w:spacing w:before="120" w:after="0"/>
       </w:pPr>
       <w:r>
-        <w:t>Hola soy una conclusión</w:t>
+        <w:tab/>
+        <w:t>Conocer el cómo el sistema operativo realiza su comunicación con el hardware y las distintas variables que proporcionan información es fundamental para realizar programas en ensamblador y comprender de mejor manera como el programa gestiona la memoria interna a la hora de gestionar segmentos de memoria con aplicaciones desarrolladas en alto nivel.</w:t>
       </w:r>
     </w:p>
     <w:p>
@@ -3123,8 +3167,54 @@
       <w:bookmarkEnd w:id="10"/>
     </w:p>
     <w:p>
-      <w:r>
-        <w:t>Hola soy una bibliografía en formato APA</w:t>
+      <w:pPr>
+        <w:pStyle w:val="Prrafodelista"/>
+        <w:numPr>
+          <w:ilvl w:val="0"/>
+          <w:numId w:val="37"/>
+        </w:numPr>
+      </w:pPr>
+      <w:r>
+        <w:t xml:space="preserve">Bray, B. Barry (2006). </w:t>
+      </w:r>
+      <w:r>
+        <w:rPr>
+          <w:i/>
+          <w:iCs/>
+        </w:rPr>
+        <w:t xml:space="preserve">Microprocesadores Intel </w:t>
+      </w:r>
+      <w:r>
+        <w:t>(7ma Edición)</w:t>
+      </w:r>
+      <w:r>
+        <w:rPr>
+          <w:i/>
+          <w:iCs/>
+        </w:rPr>
+        <w:t>.</w:t>
+      </w:r>
+      <w:r>
+        <w:t xml:space="preserve"> Person </w:t>
+      </w:r>
+      <w:proofErr w:type="spellStart"/>
+      <w:r>
+        <w:t>Education</w:t>
+      </w:r>
+      <w:proofErr w:type="spellEnd"/>
+      <w:r>
+        <w:t xml:space="preserve"> </w:t>
+      </w:r>
+      <w:hyperlink r:id="rId13" w:history="1">
+        <w:r>
+          <w:rPr>
+            <w:rStyle w:val="Hipervnculo"/>
+          </w:rPr>
+          <w:t>https://apps.utel.edu.mx/recursos/files/r161r/w25041w/Microprocesadores_intel_-_Barry_B._Brey1.pdf</w:t>
+        </w:r>
+      </w:hyperlink>
+      <w:r>
+        <w:t xml:space="preserve"> </w:t>
       </w:r>
     </w:p>
     <w:p/>
@@ -3136,12 +3226,11 @@
     <w:p/>
     <w:p/>
     <w:p/>
-    <w:p/>
     <w:sectPr>
-      <w:headerReference w:type="even" r:id="rId13"/>
-      <w:headerReference w:type="default" r:id="rId14"/>
-      <w:footerReference w:type="even" r:id="rId15"/>
-      <w:footerReference w:type="default" r:id="rId16"/>
+      <w:headerReference w:type="even" r:id="rId14"/>
+      <w:headerReference w:type="default" r:id="rId15"/>
+      <w:footerReference w:type="even" r:id="rId16"/>
+      <w:footerReference w:type="default" r:id="rId17"/>
       <w:pgSz w:w="12240" w:h="15840"/>
       <w:pgMar w:top="1418" w:right="1134" w:bottom="1418" w:left="1701" w:header="720" w:footer="720" w:gutter="284"/>
       <w:pgBorders w:offsetFrom="page">
@@ -3769,6 +3858,119 @@
     </w:lvl>
   </w:abstractNum>
   <w:abstractNum w:abstractNumId="4" w15:restartNumberingAfterBreak="0">
+    <w:nsid w:val="06D721DE"/>
+    <w:multiLevelType w:val="hybridMultilevel"/>
+    <w:tmpl w:val="0AC44E24"/>
+    <w:lvl w:ilvl="0" w:tplc="080A0001">
+      <w:start w:val="1"/>
+      <w:numFmt w:val="bullet"/>
+      <w:lvlText w:val=""/>
+      <w:lvlJc w:val="left"/>
+      <w:pPr>
+        <w:ind w:left="720" w:hanging="360"/>
+      </w:pPr>
+      <w:rPr>
+        <w:rFonts w:ascii="Symbol" w:hAnsi="Symbol" w:hint="default"/>
+      </w:rPr>
+    </w:lvl>
+    <w:lvl w:ilvl="1" w:tplc="080A0003" w:tentative="1">
+      <w:start w:val="1"/>
+      <w:numFmt w:val="bullet"/>
+      <w:lvlText w:val="o"/>
+      <w:lvlJc w:val="left"/>
+      <w:pPr>
+        <w:ind w:left="1440" w:hanging="360"/>
+      </w:pPr>
+      <w:rPr>
+        <w:rFonts w:ascii="Courier New" w:hAnsi="Courier New" w:cs="Courier New" w:hint="default"/>
+      </w:rPr>
+    </w:lvl>
+    <w:lvl w:ilvl="2" w:tplc="080A0005" w:tentative="1">
+      <w:start w:val="1"/>
+      <w:numFmt w:val="bullet"/>
+      <w:lvlText w:val=""/>
+      <w:lvlJc w:val="left"/>
+      <w:pPr>
+        <w:ind w:left="2160" w:hanging="360"/>
+      </w:pPr>
+      <w:rPr>
+        <w:rFonts w:ascii="Wingdings" w:hAnsi="Wingdings" w:hint="default"/>
+      </w:rPr>
+    </w:lvl>
+    <w:lvl w:ilvl="3" w:tplc="080A0001" w:tentative="1">
+      <w:start w:val="1"/>
+      <w:numFmt w:val="bullet"/>
+      <w:lvlText w:val=""/>
+      <w:lvlJc w:val="left"/>
+      <w:pPr>
+        <w:ind w:left="2880" w:hanging="360"/>
+      </w:pPr>
+      <w:rPr>
+        <w:rFonts w:ascii="Symbol" w:hAnsi="Symbol" w:hint="default"/>
+      </w:rPr>
+    </w:lvl>
+    <w:lvl w:ilvl="4" w:tplc="080A0003" w:tentative="1">
+      <w:start w:val="1"/>
+      <w:numFmt w:val="bullet"/>
+      <w:lvlText w:val="o"/>
+      <w:lvlJc w:val="left"/>
+      <w:pPr>
+        <w:ind w:left="3600" w:hanging="360"/>
+      </w:pPr>
+      <w:rPr>
+        <w:rFonts w:ascii="Courier New" w:hAnsi="Courier New" w:cs="Courier New" w:hint="default"/>
+      </w:rPr>
+    </w:lvl>
+    <w:lvl w:ilvl="5" w:tplc="080A0005" w:tentative="1">
+      <w:start w:val="1"/>
+      <w:numFmt w:val="bullet"/>
+      <w:lvlText w:val=""/>
+      <w:lvlJc w:val="left"/>
+      <w:pPr>
+        <w:ind w:left="4320" w:hanging="360"/>
+      </w:pPr>
+      <w:rPr>
+        <w:rFonts w:ascii="Wingdings" w:hAnsi="Wingdings" w:hint="default"/>
+      </w:rPr>
+    </w:lvl>
+    <w:lvl w:ilvl="6" w:tplc="080A0001" w:tentative="1">
+      <w:start w:val="1"/>
+      <w:numFmt w:val="bullet"/>
+      <w:lvlText w:val=""/>
+      <w:lvlJc w:val="left"/>
+      <w:pPr>
+        <w:ind w:left="5040" w:hanging="360"/>
+      </w:pPr>
+      <w:rPr>
+        <w:rFonts w:ascii="Symbol" w:hAnsi="Symbol" w:hint="default"/>
+      </w:rPr>
+    </w:lvl>
+    <w:lvl w:ilvl="7" w:tplc="080A0003" w:tentative="1">
+      <w:start w:val="1"/>
+      <w:numFmt w:val="bullet"/>
+      <w:lvlText w:val="o"/>
+      <w:lvlJc w:val="left"/>
+      <w:pPr>
+        <w:ind w:left="5760" w:hanging="360"/>
+      </w:pPr>
+      <w:rPr>
+        <w:rFonts w:ascii="Courier New" w:hAnsi="Courier New" w:cs="Courier New" w:hint="default"/>
+      </w:rPr>
+    </w:lvl>
+    <w:lvl w:ilvl="8" w:tplc="080A0005" w:tentative="1">
+      <w:start w:val="1"/>
+      <w:numFmt w:val="bullet"/>
+      <w:lvlText w:val=""/>
+      <w:lvlJc w:val="left"/>
+      <w:pPr>
+        <w:ind w:left="6480" w:hanging="360"/>
+      </w:pPr>
+      <w:rPr>
+        <w:rFonts w:ascii="Wingdings" w:hAnsi="Wingdings" w:hint="default"/>
+      </w:rPr>
+    </w:lvl>
+  </w:abstractNum>
+  <w:abstractNum w:abstractNumId="5" w15:restartNumberingAfterBreak="0">
     <w:nsid w:val="0C8A4DBB"/>
     <w:multiLevelType w:val="hybridMultilevel"/>
     <w:tmpl w:val="A15A6EC4"/>
@@ -3881,7 +4083,7 @@
       </w:rPr>
     </w:lvl>
   </w:abstractNum>
-  <w:abstractNum w:abstractNumId="5" w15:restartNumberingAfterBreak="0">
+  <w:abstractNum w:abstractNumId="6" w15:restartNumberingAfterBreak="0">
     <w:nsid w:val="0F695D61"/>
     <w:multiLevelType w:val="hybridMultilevel"/>
     <w:tmpl w:val="252EDE04"/>
@@ -3967,7 +4169,7 @@
       </w:pPr>
     </w:lvl>
   </w:abstractNum>
-  <w:abstractNum w:abstractNumId="6" w15:restartNumberingAfterBreak="0">
+  <w:abstractNum w:abstractNumId="7" w15:restartNumberingAfterBreak="0">
     <w:nsid w:val="11081312"/>
     <w:multiLevelType w:val="hybridMultilevel"/>
     <w:tmpl w:val="9E5816B2"/>
@@ -4053,7 +4255,7 @@
       </w:pPr>
     </w:lvl>
   </w:abstractNum>
-  <w:abstractNum w:abstractNumId="7" w15:restartNumberingAfterBreak="0">
+  <w:abstractNum w:abstractNumId="8" w15:restartNumberingAfterBreak="0">
     <w:nsid w:val="15B75010"/>
     <w:multiLevelType w:val="hybridMultilevel"/>
     <w:tmpl w:val="85520E40"/>
@@ -4166,7 +4368,7 @@
       </w:rPr>
     </w:lvl>
   </w:abstractNum>
-  <w:abstractNum w:abstractNumId="8" w15:restartNumberingAfterBreak="0">
+  <w:abstractNum w:abstractNumId="9" w15:restartNumberingAfterBreak="0">
     <w:nsid w:val="1AEC06E6"/>
     <w:multiLevelType w:val="hybridMultilevel"/>
     <w:tmpl w:val="CDD8829A"/>
@@ -4279,7 +4481,7 @@
       </w:rPr>
     </w:lvl>
   </w:abstractNum>
-  <w:abstractNum w:abstractNumId="9" w15:restartNumberingAfterBreak="0">
+  <w:abstractNum w:abstractNumId="10" w15:restartNumberingAfterBreak="0">
     <w:nsid w:val="2357072B"/>
     <w:multiLevelType w:val="hybridMultilevel"/>
     <w:tmpl w:val="383E2788"/>
@@ -4392,7 +4594,7 @@
       </w:rPr>
     </w:lvl>
   </w:abstractNum>
-  <w:abstractNum w:abstractNumId="10" w15:restartNumberingAfterBreak="0">
+  <w:abstractNum w:abstractNumId="11" w15:restartNumberingAfterBreak="0">
     <w:nsid w:val="252C402B"/>
     <w:multiLevelType w:val="hybridMultilevel"/>
     <w:tmpl w:val="E3828E10"/>
@@ -4505,7 +4707,7 @@
       </w:rPr>
     </w:lvl>
   </w:abstractNum>
-  <w:abstractNum w:abstractNumId="11" w15:restartNumberingAfterBreak="0">
+  <w:abstractNum w:abstractNumId="12" w15:restartNumberingAfterBreak="0">
     <w:nsid w:val="26704FAC"/>
     <w:multiLevelType w:val="hybridMultilevel"/>
     <w:tmpl w:val="78A259AE"/>
@@ -4618,7 +4820,7 @@
       </w:rPr>
     </w:lvl>
   </w:abstractNum>
-  <w:abstractNum w:abstractNumId="12" w15:restartNumberingAfterBreak="0">
+  <w:abstractNum w:abstractNumId="13" w15:restartNumberingAfterBreak="0">
     <w:nsid w:val="27A2319E"/>
     <w:multiLevelType w:val="hybridMultilevel"/>
     <w:tmpl w:val="E974ABBC"/>
@@ -4731,7 +4933,7 @@
       </w:rPr>
     </w:lvl>
   </w:abstractNum>
-  <w:abstractNum w:abstractNumId="13" w15:restartNumberingAfterBreak="0">
+  <w:abstractNum w:abstractNumId="14" w15:restartNumberingAfterBreak="0">
     <w:nsid w:val="2A4E31E0"/>
     <w:multiLevelType w:val="hybridMultilevel"/>
     <w:tmpl w:val="595C7D88"/>
@@ -4844,7 +5046,7 @@
       </w:rPr>
     </w:lvl>
   </w:abstractNum>
-  <w:abstractNum w:abstractNumId="14" w15:restartNumberingAfterBreak="0">
+  <w:abstractNum w:abstractNumId="15" w15:restartNumberingAfterBreak="0">
     <w:nsid w:val="2C0B5195"/>
     <w:multiLevelType w:val="hybridMultilevel"/>
     <w:tmpl w:val="FE9C5F14"/>
@@ -4957,7 +5159,7 @@
       </w:rPr>
     </w:lvl>
   </w:abstractNum>
-  <w:abstractNum w:abstractNumId="15" w15:restartNumberingAfterBreak="0">
+  <w:abstractNum w:abstractNumId="16" w15:restartNumberingAfterBreak="0">
     <w:nsid w:val="32E8256A"/>
     <w:multiLevelType w:val="hybridMultilevel"/>
     <w:tmpl w:val="35B27F0C"/>
@@ -5070,7 +5272,7 @@
       </w:rPr>
     </w:lvl>
   </w:abstractNum>
-  <w:abstractNum w:abstractNumId="16" w15:restartNumberingAfterBreak="0">
+  <w:abstractNum w:abstractNumId="17" w15:restartNumberingAfterBreak="0">
     <w:nsid w:val="3D2C0E66"/>
     <w:multiLevelType w:val="hybridMultilevel"/>
     <w:tmpl w:val="324A86FE"/>
@@ -5183,7 +5385,7 @@
       </w:rPr>
     </w:lvl>
   </w:abstractNum>
-  <w:abstractNum w:abstractNumId="17" w15:restartNumberingAfterBreak="0">
+  <w:abstractNum w:abstractNumId="18" w15:restartNumberingAfterBreak="0">
     <w:nsid w:val="3D4950BC"/>
     <w:multiLevelType w:val="hybridMultilevel"/>
     <w:tmpl w:val="32C636D8"/>
@@ -5296,7 +5498,7 @@
       </w:rPr>
     </w:lvl>
   </w:abstractNum>
-  <w:abstractNum w:abstractNumId="18" w15:restartNumberingAfterBreak="0">
+  <w:abstractNum w:abstractNumId="19" w15:restartNumberingAfterBreak="0">
     <w:nsid w:val="3EE357D5"/>
     <w:multiLevelType w:val="hybridMultilevel"/>
     <w:tmpl w:val="B06250B4"/>
@@ -5409,7 +5611,7 @@
       </w:rPr>
     </w:lvl>
   </w:abstractNum>
-  <w:abstractNum w:abstractNumId="19" w15:restartNumberingAfterBreak="0">
+  <w:abstractNum w:abstractNumId="20" w15:restartNumberingAfterBreak="0">
     <w:nsid w:val="432058A2"/>
     <w:multiLevelType w:val="hybridMultilevel"/>
     <w:tmpl w:val="EC5621DC"/>
@@ -5522,7 +5724,7 @@
       </w:rPr>
     </w:lvl>
   </w:abstractNum>
-  <w:abstractNum w:abstractNumId="20" w15:restartNumberingAfterBreak="0">
+  <w:abstractNum w:abstractNumId="21" w15:restartNumberingAfterBreak="0">
     <w:nsid w:val="45C55BFE"/>
     <w:multiLevelType w:val="hybridMultilevel"/>
     <w:tmpl w:val="D92E599C"/>
@@ -5635,7 +5837,7 @@
       </w:rPr>
     </w:lvl>
   </w:abstractNum>
-  <w:abstractNum w:abstractNumId="21" w15:restartNumberingAfterBreak="0">
+  <w:abstractNum w:abstractNumId="22" w15:restartNumberingAfterBreak="0">
     <w:nsid w:val="4789116B"/>
     <w:multiLevelType w:val="hybridMultilevel"/>
     <w:tmpl w:val="F5D0E744"/>
@@ -5748,7 +5950,7 @@
       </w:rPr>
     </w:lvl>
   </w:abstractNum>
-  <w:abstractNum w:abstractNumId="22" w15:restartNumberingAfterBreak="0">
+  <w:abstractNum w:abstractNumId="23" w15:restartNumberingAfterBreak="0">
     <w:nsid w:val="4FA653D3"/>
     <w:multiLevelType w:val="hybridMultilevel"/>
     <w:tmpl w:val="2F145B30"/>
@@ -5837,7 +6039,7 @@
       </w:pPr>
     </w:lvl>
   </w:abstractNum>
-  <w:abstractNum w:abstractNumId="23" w15:restartNumberingAfterBreak="0">
+  <w:abstractNum w:abstractNumId="24" w15:restartNumberingAfterBreak="0">
     <w:nsid w:val="5C614E09"/>
     <w:multiLevelType w:val="hybridMultilevel"/>
     <w:tmpl w:val="C6F0588A"/>
@@ -5923,7 +6125,7 @@
       </w:pPr>
     </w:lvl>
   </w:abstractNum>
-  <w:abstractNum w:abstractNumId="24" w15:restartNumberingAfterBreak="0">
+  <w:abstractNum w:abstractNumId="25" w15:restartNumberingAfterBreak="0">
     <w:nsid w:val="5D0303E9"/>
     <w:multiLevelType w:val="hybridMultilevel"/>
     <w:tmpl w:val="7BF8642E"/>
@@ -6009,7 +6211,7 @@
       </w:pPr>
     </w:lvl>
   </w:abstractNum>
-  <w:abstractNum w:abstractNumId="25" w15:restartNumberingAfterBreak="0">
+  <w:abstractNum w:abstractNumId="26" w15:restartNumberingAfterBreak="0">
     <w:nsid w:val="5D3E675A"/>
     <w:multiLevelType w:val="hybridMultilevel"/>
     <w:tmpl w:val="531CDDE4"/>
@@ -6122,7 +6324,7 @@
       </w:rPr>
     </w:lvl>
   </w:abstractNum>
-  <w:abstractNum w:abstractNumId="26" w15:restartNumberingAfterBreak="0">
+  <w:abstractNum w:abstractNumId="27" w15:restartNumberingAfterBreak="0">
     <w:nsid w:val="5E2162D0"/>
     <w:multiLevelType w:val="hybridMultilevel"/>
     <w:tmpl w:val="19F640F0"/>
@@ -6235,7 +6437,7 @@
       </w:rPr>
     </w:lvl>
   </w:abstractNum>
-  <w:abstractNum w:abstractNumId="27" w15:restartNumberingAfterBreak="0">
+  <w:abstractNum w:abstractNumId="28" w15:restartNumberingAfterBreak="0">
     <w:nsid w:val="610550E1"/>
     <w:multiLevelType w:val="hybridMultilevel"/>
     <w:tmpl w:val="317E1766"/>
@@ -6348,7 +6550,7 @@
       </w:rPr>
     </w:lvl>
   </w:abstractNum>
-  <w:abstractNum w:abstractNumId="28" w15:restartNumberingAfterBreak="0">
+  <w:abstractNum w:abstractNumId="29" w15:restartNumberingAfterBreak="0">
     <w:nsid w:val="63520ADD"/>
     <w:multiLevelType w:val="hybridMultilevel"/>
     <w:tmpl w:val="D97630C4"/>
@@ -6461,7 +6663,7 @@
       </w:rPr>
     </w:lvl>
   </w:abstractNum>
-  <w:abstractNum w:abstractNumId="29" w15:restartNumberingAfterBreak="0">
+  <w:abstractNum w:abstractNumId="30" w15:restartNumberingAfterBreak="0">
     <w:nsid w:val="65C1777E"/>
     <w:multiLevelType w:val="hybridMultilevel"/>
     <w:tmpl w:val="EAEC0930"/>
@@ -6574,7 +6776,7 @@
       </w:rPr>
     </w:lvl>
   </w:abstractNum>
-  <w:abstractNum w:abstractNumId="30" w15:restartNumberingAfterBreak="0">
+  <w:abstractNum w:abstractNumId="31" w15:restartNumberingAfterBreak="0">
     <w:nsid w:val="67A32EBF"/>
     <w:multiLevelType w:val="hybridMultilevel"/>
     <w:tmpl w:val="127C7076"/>
@@ -6687,7 +6889,7 @@
       </w:rPr>
     </w:lvl>
   </w:abstractNum>
-  <w:abstractNum w:abstractNumId="31" w15:restartNumberingAfterBreak="0">
+  <w:abstractNum w:abstractNumId="32" w15:restartNumberingAfterBreak="0">
     <w:nsid w:val="6BA55FA5"/>
     <w:multiLevelType w:val="hybridMultilevel"/>
     <w:tmpl w:val="310E65FC"/>
@@ -6800,7 +7002,7 @@
       </w:rPr>
     </w:lvl>
   </w:abstractNum>
-  <w:abstractNum w:abstractNumId="32" w15:restartNumberingAfterBreak="0">
+  <w:abstractNum w:abstractNumId="33" w15:restartNumberingAfterBreak="0">
     <w:nsid w:val="6E6F759E"/>
     <w:multiLevelType w:val="hybridMultilevel"/>
     <w:tmpl w:val="1CA448FC"/>
@@ -6913,7 +7115,7 @@
       </w:rPr>
     </w:lvl>
   </w:abstractNum>
-  <w:abstractNum w:abstractNumId="33" w15:restartNumberingAfterBreak="0">
+  <w:abstractNum w:abstractNumId="34" w15:restartNumberingAfterBreak="0">
     <w:nsid w:val="784530C1"/>
     <w:multiLevelType w:val="hybridMultilevel"/>
     <w:tmpl w:val="3CF6FE18"/>
@@ -7026,7 +7228,7 @@
       </w:rPr>
     </w:lvl>
   </w:abstractNum>
-  <w:abstractNum w:abstractNumId="34" w15:restartNumberingAfterBreak="0">
+  <w:abstractNum w:abstractNumId="35" w15:restartNumberingAfterBreak="0">
     <w:nsid w:val="7C226B17"/>
     <w:multiLevelType w:val="hybridMultilevel"/>
     <w:tmpl w:val="316EBF58"/>
@@ -7139,7 +7341,7 @@
       </w:rPr>
     </w:lvl>
   </w:abstractNum>
-  <w:abstractNum w:abstractNumId="35" w15:restartNumberingAfterBreak="0">
+  <w:abstractNum w:abstractNumId="36" w15:restartNumberingAfterBreak="0">
     <w:nsid w:val="7C7324D3"/>
     <w:multiLevelType w:val="hybridMultilevel"/>
     <w:tmpl w:val="FBB601F2"/>
@@ -7253,112 +7455,115 @@
     </w:lvl>
   </w:abstractNum>
   <w:num w:numId="1" w16cid:durableId="1507473298">
+    <w:abstractNumId w:val="7"/>
+  </w:num>
+  <w:num w:numId="2" w16cid:durableId="1810004600">
     <w:abstractNumId w:val="6"/>
   </w:num>
-  <w:num w:numId="2" w16cid:durableId="1810004600">
+  <w:num w:numId="3" w16cid:durableId="1516307261">
+    <w:abstractNumId w:val="31"/>
+  </w:num>
+  <w:num w:numId="4" w16cid:durableId="263998001">
+    <w:abstractNumId w:val="34"/>
+  </w:num>
+  <w:num w:numId="5" w16cid:durableId="1694530711">
     <w:abstractNumId w:val="5"/>
   </w:num>
-  <w:num w:numId="3" w16cid:durableId="1516307261">
-    <w:abstractNumId w:val="30"/>
+  <w:num w:numId="6" w16cid:durableId="399212304">
+    <w:abstractNumId w:val="29"/>
   </w:num>
-  <w:num w:numId="4" w16cid:durableId="263998001">
+  <w:num w:numId="7" w16cid:durableId="1510755812">
+    <w:abstractNumId w:val="36"/>
+  </w:num>
+  <w:num w:numId="8" w16cid:durableId="401295270">
     <w:abstractNumId w:val="33"/>
   </w:num>
-  <w:num w:numId="5" w16cid:durableId="1694530711">
-    <w:abstractNumId w:val="4"/>
-  </w:num>
-  <w:num w:numId="6" w16cid:durableId="399212304">
-    <w:abstractNumId w:val="28"/>
-  </w:num>
-  <w:num w:numId="7" w16cid:durableId="1510755812">
-    <w:abstractNumId w:val="35"/>
-  </w:num>
-  <w:num w:numId="8" w16cid:durableId="401295270">
-    <w:abstractNumId w:val="32"/>
-  </w:num>
   <w:num w:numId="9" w16cid:durableId="1237131580">
-    <w:abstractNumId w:val="17"/>
+    <w:abstractNumId w:val="18"/>
   </w:num>
   <w:num w:numId="10" w16cid:durableId="1815832771">
-    <w:abstractNumId w:val="20"/>
+    <w:abstractNumId w:val="21"/>
   </w:num>
   <w:num w:numId="11" w16cid:durableId="1210530553">
-    <w:abstractNumId w:val="11"/>
+    <w:abstractNumId w:val="12"/>
   </w:num>
   <w:num w:numId="12" w16cid:durableId="709888915">
-    <w:abstractNumId w:val="16"/>
+    <w:abstractNumId w:val="17"/>
   </w:num>
   <w:num w:numId="13" w16cid:durableId="1638875566">
     <w:abstractNumId w:val="0"/>
   </w:num>
   <w:num w:numId="14" w16cid:durableId="1857187464">
-    <w:abstractNumId w:val="12"/>
+    <w:abstractNumId w:val="13"/>
   </w:num>
   <w:num w:numId="15" w16cid:durableId="1398281611">
+    <w:abstractNumId w:val="11"/>
+  </w:num>
+  <w:num w:numId="16" w16cid:durableId="2101368299">
+    <w:abstractNumId w:val="27"/>
+  </w:num>
+  <w:num w:numId="17" w16cid:durableId="1383942363">
+    <w:abstractNumId w:val="16"/>
+  </w:num>
+  <w:num w:numId="18" w16cid:durableId="975914109">
+    <w:abstractNumId w:val="20"/>
+  </w:num>
+  <w:num w:numId="19" w16cid:durableId="707417816">
+    <w:abstractNumId w:val="24"/>
+  </w:num>
+  <w:num w:numId="20" w16cid:durableId="1331831440">
+    <w:abstractNumId w:val="9"/>
+  </w:num>
+  <w:num w:numId="21" w16cid:durableId="1910534101">
+    <w:abstractNumId w:val="35"/>
+  </w:num>
+  <w:num w:numId="22" w16cid:durableId="124473379">
     <w:abstractNumId w:val="10"/>
   </w:num>
-  <w:num w:numId="16" w16cid:durableId="2101368299">
+  <w:num w:numId="23" w16cid:durableId="256406080">
     <w:abstractNumId w:val="26"/>
-  </w:num>
-  <w:num w:numId="17" w16cid:durableId="1383942363">
-    <w:abstractNumId w:val="15"/>
-  </w:num>
-  <w:num w:numId="18" w16cid:durableId="975914109">
-    <w:abstractNumId w:val="19"/>
-  </w:num>
-  <w:num w:numId="19" w16cid:durableId="707417816">
-    <w:abstractNumId w:val="23"/>
-  </w:num>
-  <w:num w:numId="20" w16cid:durableId="1331831440">
-    <w:abstractNumId w:val="8"/>
-  </w:num>
-  <w:num w:numId="21" w16cid:durableId="1910534101">
-    <w:abstractNumId w:val="34"/>
-  </w:num>
-  <w:num w:numId="22" w16cid:durableId="124473379">
-    <w:abstractNumId w:val="9"/>
-  </w:num>
-  <w:num w:numId="23" w16cid:durableId="256406080">
-    <w:abstractNumId w:val="25"/>
   </w:num>
   <w:num w:numId="24" w16cid:durableId="1952279886">
     <w:abstractNumId w:val="1"/>
   </w:num>
   <w:num w:numId="25" w16cid:durableId="667830043">
-    <w:abstractNumId w:val="7"/>
+    <w:abstractNumId w:val="8"/>
   </w:num>
   <w:num w:numId="26" w16cid:durableId="200168938">
-    <w:abstractNumId w:val="18"/>
+    <w:abstractNumId w:val="19"/>
   </w:num>
   <w:num w:numId="27" w16cid:durableId="240065754">
-    <w:abstractNumId w:val="14"/>
+    <w:abstractNumId w:val="15"/>
   </w:num>
   <w:num w:numId="28" w16cid:durableId="1593396341">
-    <w:abstractNumId w:val="24"/>
+    <w:abstractNumId w:val="25"/>
   </w:num>
   <w:num w:numId="29" w16cid:durableId="36511375">
-    <w:abstractNumId w:val="22"/>
+    <w:abstractNumId w:val="23"/>
   </w:num>
   <w:num w:numId="30" w16cid:durableId="853804131">
     <w:abstractNumId w:val="2"/>
   </w:num>
   <w:num w:numId="31" w16cid:durableId="1256211548">
-    <w:abstractNumId w:val="21"/>
+    <w:abstractNumId w:val="22"/>
   </w:num>
   <w:num w:numId="32" w16cid:durableId="1482887219">
-    <w:abstractNumId w:val="13"/>
+    <w:abstractNumId w:val="14"/>
   </w:num>
   <w:num w:numId="33" w16cid:durableId="1207986705">
-    <w:abstractNumId w:val="27"/>
+    <w:abstractNumId w:val="28"/>
   </w:num>
   <w:num w:numId="34" w16cid:durableId="884833427">
-    <w:abstractNumId w:val="31"/>
+    <w:abstractNumId w:val="32"/>
   </w:num>
   <w:num w:numId="35" w16cid:durableId="497235551">
     <w:abstractNumId w:val="3"/>
   </w:num>
   <w:num w:numId="36" w16cid:durableId="1722053768">
-    <w:abstractNumId w:val="29"/>
+    <w:abstractNumId w:val="30"/>
+  </w:num>
+  <w:num w:numId="37" w16cid:durableId="1238441295">
+    <w:abstractNumId w:val="4"/>
   </w:num>
   <w:numIdMacAtCleanup w:val="13"/>
 </w:numbering>
@@ -7842,7 +8047,6 @@
   <w:style w:type="character" w:default="1" w:styleId="Fuentedeprrafopredeter">
     <w:name w:val="Default Paragraph Font"/>
     <w:uiPriority w:val="1"/>
-    <w:semiHidden/>
     <w:unhideWhenUsed/>
   </w:style>
   <w:style w:type="table" w:default="1" w:styleId="Tablanormal">

</xml_diff>

<commit_message>
libro para Inovación y Tecnología agregado!
</commit_message>
<xml_diff>
--- a/TAREAS 6 SEMESTRE/Programación Bajo Nivel/QuijasContrerasAct1.docx
+++ b/TAREAS 6 SEMESTRE/Programación Bajo Nivel/QuijasContrerasAct1.docx
@@ -2136,7 +2136,7 @@
                 <w:noProof/>
                 <w:webHidden/>
               </w:rPr>
-              <w:t>5</w:t>
+              <w:t>4</w:t>
             </w:r>
             <w:r>
               <w:rPr>
@@ -2206,7 +2206,7 @@
                 <w:noProof/>
                 <w:webHidden/>
               </w:rPr>
-              <w:t>5</w:t>
+              <w:t>4</w:t>
             </w:r>
             <w:r>
               <w:rPr>
@@ -2822,7 +2822,7 @@
         <w:t>A (Acarreo auxiliar):</w:t>
       </w:r>
       <w:r>
-        <w:t xml:space="preserve"> Guarda el acarreo después de la adición o la sustracción entre las posiciones de bit 3 y 4 del resultado. Este bit altamente especializado lo comprueban las instrucciones DAA y DAS para ajustar el valor de AL después de una suma o resta BCD. </w:t>
+        <w:t xml:space="preserve"> Guarda el acarreo después de la adición o la sustracción entre las posiciones de bit 3 y 4 del resultado. </w:t>
       </w:r>
     </w:p>
     <w:p>
@@ -2864,10 +2864,10 @@
         </w:numPr>
       </w:pPr>
       <w:r>
-        <w:t>T (Trampa):</w:t>
-      </w:r>
-      <w:r>
-        <w:t xml:space="preserve"> Habilita el atrapamiento a través de una característica de depuración integrada en el chip. Si T = 1, el microprocesador interrumpe el flujo del programa basándose en las condiciones indicadas por los registros de depuración y los registros de control. Si T = 0 entonces se deshabilita la característica de depuración.</w:t>
+        <w:t>I (Interrupción):</w:t>
+      </w:r>
+      <w:r>
+        <w:t xml:space="preserve"> Controla la operación de la terminal de entrada. Si I = 1, se habilita la termina INTR, si I = 0 entonces se deshabilita. El estado del bit se controla mediante las instrucciones STI y CLI.</w:t>
       </w:r>
     </w:p>
     <w:p>
@@ -2879,11 +2879,13 @@
         </w:numPr>
       </w:pPr>
       <w:r>
-        <w:lastRenderedPageBreak/>
-        <w:t>I (Interrupción):</w:t>
-      </w:r>
-      <w:r>
-        <w:t xml:space="preserve"> Controla la operación de la terminal de entrada. Si I = 1, se habilita la termina INTR, si I = 0 entonces se deshabilita. El estado del bit se controla mediante las instrucciones STI y CLI.</w:t>
+        <w:t>D (Dirección):</w:t>
+      </w:r>
+      <w:r>
+        <w:t xml:space="preserve"> </w:t>
+      </w:r>
+      <w:r>
+        <w:t>Selecciona el modo de incremento o de decremento para los registros DI y/o SI durante las instrucciones de cadena. S D = 1, los registros se decrementan automáticamente. Si D = 0, se incrementan automáticamente.</w:t>
       </w:r>
     </w:p>
     <w:p>
@@ -2895,160 +2897,10 @@
         </w:numPr>
       </w:pPr>
       <w:r>
-        <w:t>D (Dirección):</w:t>
-      </w:r>
-      <w:r>
-        <w:t xml:space="preserve"> </w:t>
-      </w:r>
-      <w:r>
-        <w:t>Selecciona el modo de incremento o de decremento para los registros DI y/o SI durante las instrucciones de cadena. S D = 1, los registros se decrementan automáticamente. Si D = 0, se incrementan automáticamente.</w:t>
-      </w:r>
-    </w:p>
-    <w:p>
-      <w:pPr>
-        <w:pStyle w:val="Prrafodelista"/>
-        <w:numPr>
-          <w:ilvl w:val="0"/>
-          <w:numId w:val="35"/>
-        </w:numPr>
-      </w:pPr>
-      <w:r>
         <w:t>O (Desbordamiento):</w:t>
       </w:r>
       <w:r>
         <w:t xml:space="preserve"> Indica si el resultado ha excedido la capacidad de la máquina. </w:t>
-      </w:r>
-    </w:p>
-    <w:p>
-      <w:pPr>
-        <w:pStyle w:val="Prrafodelista"/>
-        <w:numPr>
-          <w:ilvl w:val="0"/>
-          <w:numId w:val="35"/>
-        </w:numPr>
-      </w:pPr>
-      <w:r>
-        <w:t>IOPL (Nivel de privilegio de E/S):</w:t>
-      </w:r>
-      <w:r>
-        <w:t xml:space="preserve"> Se utiliza en modo protegido para seleccionar el nivel de privilegio para los dispositivos de E/S. Si el nivel de privilegio es de igual o mayor confianza que el IOPL, la operación se ejecuta, si no, se produce una interrupción.</w:t>
-      </w:r>
-    </w:p>
-    <w:p>
-      <w:pPr>
-        <w:pStyle w:val="Prrafodelista"/>
-        <w:numPr>
-          <w:ilvl w:val="0"/>
-          <w:numId w:val="35"/>
-        </w:numPr>
-      </w:pPr>
-      <w:r>
-        <w:t>NT (Tarea anidada):</w:t>
-      </w:r>
-      <w:r>
-        <w:t xml:space="preserve"> Indica que la tarea está anidada a otra tarea.</w:t>
-      </w:r>
-    </w:p>
-    <w:p>
-      <w:pPr>
-        <w:pStyle w:val="Prrafodelista"/>
-        <w:numPr>
-          <w:ilvl w:val="0"/>
-          <w:numId w:val="35"/>
-        </w:numPr>
-      </w:pPr>
-      <w:r>
-        <w:t>RF (Continuación):</w:t>
-      </w:r>
-      <w:r>
-        <w:t xml:space="preserve"> se utiliza con la depuración para controlar la continuación de la ejecución después de la siguiente instrucción.</w:t>
-      </w:r>
-    </w:p>
-    <w:p>
-      <w:pPr>
-        <w:pStyle w:val="Prrafodelista"/>
-        <w:numPr>
-          <w:ilvl w:val="0"/>
-          <w:numId w:val="35"/>
-        </w:numPr>
-      </w:pPr>
-      <w:r>
-        <w:t>VM (Modo virtual):</w:t>
-      </w:r>
-      <w:r>
-        <w:t xml:space="preserve"> </w:t>
-      </w:r>
-      <w:r>
-        <w:t>selecciona la operación en modo virtual en un sistema de modo protegido.</w:t>
-      </w:r>
-    </w:p>
-    <w:p>
-      <w:pPr>
-        <w:pStyle w:val="Prrafodelista"/>
-        <w:numPr>
-          <w:ilvl w:val="0"/>
-          <w:numId w:val="35"/>
-        </w:numPr>
-      </w:pPr>
-      <w:r>
-        <w:t>AC (comprobación de alineación):</w:t>
-      </w:r>
-      <w:r>
-        <w:t xml:space="preserve"> Se activa si se direcciona una palabra o doble palabra en un límite que no sea de palabra o de doble palabra.</w:t>
-      </w:r>
-    </w:p>
-    <w:p>
-      <w:pPr>
-        <w:pStyle w:val="Prrafodelista"/>
-        <w:numPr>
-          <w:ilvl w:val="0"/>
-          <w:numId w:val="35"/>
-        </w:numPr>
-      </w:pPr>
-      <w:r>
-        <w:t>VIF (Interrupción virtual):</w:t>
-      </w:r>
-      <w:r>
-        <w:t xml:space="preserve"> es una copia del bit de interrupción.</w:t>
-      </w:r>
-    </w:p>
-    <w:p>
-      <w:pPr>
-        <w:pStyle w:val="Prrafodelista"/>
-        <w:numPr>
-          <w:ilvl w:val="0"/>
-          <w:numId w:val="35"/>
-        </w:numPr>
-      </w:pPr>
-      <w:r>
-        <w:t>VIP (interrupción virtual pendiente):</w:t>
-      </w:r>
-      <w:r>
-        <w:t xml:space="preserve"> Proporciona información sobre una interrupción en modo virtual. Proporciona banderas de interrupción virtual al sistema, además de interrupciones pendientes.</w:t>
-      </w:r>
-    </w:p>
-    <w:p>
-      <w:pPr>
-        <w:pStyle w:val="Prrafodelista"/>
-        <w:numPr>
-          <w:ilvl w:val="0"/>
-          <w:numId w:val="35"/>
-        </w:numPr>
-      </w:pPr>
-      <w:r>
-        <w:t>ID (identificación):</w:t>
-      </w:r>
-      <w:r>
-        <w:t xml:space="preserve"> Indica si el procesador soporta la instrucción CPUID. Solo disponible para el microprocesador Pentium y proporciona su </w:t>
-      </w:r>
-      <w:r>
-        <w:rPr>
-          <w:u w:val="single"/>
-        </w:rPr>
-        <w:t>número</w:t>
-      </w:r>
-      <w:r>
-        <w:t xml:space="preserve"> de versión y el fabricante.</w:t>
       </w:r>
     </w:p>
     <w:p>
@@ -3059,6 +2911,7 @@
         <w:rPr>
           <w:noProof/>
         </w:rPr>
+        <w:lastRenderedPageBreak/>
         <w:drawing>
           <wp:inline distT="0" distB="0" distL="0" distR="0" wp14:anchorId="0AC376FA" wp14:editId="72504B03">
             <wp:extent cx="5791835" cy="2150110"/>
@@ -3142,7 +2995,6 @@
       </w:pPr>
       <w:bookmarkStart w:id="9" w:name="_Toc238505600"/>
       <w:r>
-        <w:lastRenderedPageBreak/>
         <w:t>Conclusión</w:t>
       </w:r>
       <w:bookmarkEnd w:id="9"/>
@@ -3195,15 +3047,7 @@
         <w:t>.</w:t>
       </w:r>
       <w:r>
-        <w:t xml:space="preserve"> Person </w:t>
-      </w:r>
-      <w:proofErr w:type="spellStart"/>
-      <w:r>
-        <w:t>Education</w:t>
-      </w:r>
-      <w:proofErr w:type="spellEnd"/>
-      <w:r>
-        <w:t xml:space="preserve"> </w:t>
+        <w:t xml:space="preserve"> Person Education </w:t>
       </w:r>
       <w:hyperlink r:id="rId13" w:history="1">
         <w:r>
@@ -3217,7 +3061,6 @@
         <w:t xml:space="preserve"> </w:t>
       </w:r>
     </w:p>
-    <w:p/>
     <w:p/>
     <w:p/>
     <w:p/>
@@ -8047,6 +7890,7 @@
   <w:style w:type="character" w:default="1" w:styleId="Fuentedeprrafopredeter">
     <w:name w:val="Default Paragraph Font"/>
     <w:uiPriority w:val="1"/>
+    <w:semiHidden/>
     <w:unhideWhenUsed/>
   </w:style>
   <w:style w:type="table" w:default="1" w:styleId="Tablanormal">

</xml_diff>